<commit_message>
docs(peml): add team member names and roles to week 3 deliverables
</commit_message>
<xml_diff>
--- a/Reporte_TiendaExpres_Semana3.docx
+++ b/Reporte_TiendaExpres_Semana3.docx
@@ -56,7 +56,7 @@
       <w:tr>
         <w:tc>
           <w:tcPr>
-            <w:tcW w:type="dxa" w:w="2381"/>
+            <w:tcW w:type="dxa" w:w="2041"/>
             <w:shd w:val="clear" w:fill="1B2A4A"/>
           </w:tcPr>
           <w:p>
@@ -90,7 +90,7 @@
         </w:tc>
         <w:tc>
           <w:tcPr>
-            <w:tcW w:type="dxa" w:w="3402"/>
+            <w:tcW w:type="dxa" w:w="3742"/>
             <w:shd w:val="clear" w:fill="1B2A4A"/>
           </w:tcPr>
           <w:p>
@@ -109,7 +109,7 @@
       <w:tr>
         <w:tc>
           <w:tcPr>
-            <w:tcW w:type="dxa" w:w="2381"/>
+            <w:tcW w:type="dxa" w:w="2041"/>
           </w:tcPr>
           <w:p>
             <w:pPr>
@@ -120,7 +120,60 @@
               <w:rPr>
                 <w:sz w:val="18"/>
               </w:rPr>
-              <w:t>[Nombre 1]</w:t>
+              <w:t>Santiago Merino</w:t>
+            </w:r>
+          </w:p>
+        </w:tc>
+        <w:tc>
+          <w:tcPr>
+            <w:tcW w:type="dxa" w:w="2835"/>
+          </w:tcPr>
+          <w:p>
+            <w:pPr>
+              <w:spacing w:after="20"/>
+            </w:pPr>
+            <w:r/>
+            <w:r>
+              <w:rPr>
+                <w:sz w:val="18"/>
+              </w:rPr>
+              <w:t>Programador</w:t>
+            </w:r>
+          </w:p>
+        </w:tc>
+        <w:tc>
+          <w:tcPr>
+            <w:tcW w:type="dxa" w:w="3742"/>
+          </w:tcPr>
+          <w:p>
+            <w:pPr>
+              <w:spacing w:after="20"/>
+            </w:pPr>
+            <w:r/>
+            <w:r>
+              <w:rPr>
+                <w:sz w:val="18"/>
+              </w:rPr>
+              <w:t>Script en Python, simulación Monte Carlo y gráficos</w:t>
+            </w:r>
+          </w:p>
+        </w:tc>
+      </w:tr>
+      <w:tr>
+        <w:tc>
+          <w:tcPr>
+            <w:tcW w:type="dxa" w:w="2041"/>
+          </w:tcPr>
+          <w:p>
+            <w:pPr>
+              <w:spacing w:after="20"/>
+            </w:pPr>
+            <w:r/>
+            <w:r>
+              <w:rPr>
+                <w:sz w:val="18"/>
+              </w:rPr>
+              <w:t>Juan Diego Cornejo</w:t>
             </w:r>
           </w:p>
         </w:tc>
@@ -143,7 +196,7 @@
         </w:tc>
         <w:tc>
           <w:tcPr>
-            <w:tcW w:type="dxa" w:w="3402"/>
+            <w:tcW w:type="dxa" w:w="3742"/>
           </w:tcPr>
           <w:p>
             <w:pPr>
@@ -154,7 +207,7 @@
               <w:rPr>
                 <w:sz w:val="18"/>
               </w:rPr>
-              <w:t>Descriptivos, IQR y probabilidades teóricas</w:t>
+              <w:t>Descriptivos, método IQR y probabilidades teóricas</w:t>
             </w:r>
           </w:p>
         </w:tc>
@@ -162,7 +215,7 @@
       <w:tr>
         <w:tc>
           <w:tcPr>
-            <w:tcW w:type="dxa" w:w="2381"/>
+            <w:tcW w:type="dxa" w:w="2041"/>
           </w:tcPr>
           <w:p>
             <w:pPr>
@@ -173,7 +226,7 @@
               <w:rPr>
                 <w:sz w:val="18"/>
               </w:rPr>
-              <w:t>[Nombre 2]</w:t>
+              <w:t>Jonathan Delgado</w:t>
             </w:r>
           </w:p>
         </w:tc>
@@ -190,13 +243,13 @@
               <w:rPr>
                 <w:sz w:val="18"/>
               </w:rPr>
-              <w:t>Programador/a</w:t>
+              <w:t>Comunicador de negocio y coordinador de calidad</w:t>
             </w:r>
           </w:p>
         </w:tc>
         <w:tc>
           <w:tcPr>
-            <w:tcW w:type="dxa" w:w="3402"/>
+            <w:tcW w:type="dxa" w:w="3742"/>
           </w:tcPr>
           <w:p>
             <w:pPr>
@@ -207,113 +260,7 @@
               <w:rPr>
                 <w:sz w:val="18"/>
               </w:rPr>
-              <w:t>Script en Python y simulación Monte Carlo</w:t>
-            </w:r>
-          </w:p>
-        </w:tc>
-      </w:tr>
-      <w:tr>
-        <w:tc>
-          <w:tcPr>
-            <w:tcW w:type="dxa" w:w="2381"/>
-          </w:tcPr>
-          <w:p>
-            <w:pPr>
-              <w:spacing w:after="20"/>
-            </w:pPr>
-            <w:r/>
-            <w:r>
-              <w:rPr>
-                <w:sz w:val="18"/>
-              </w:rPr>
-              <w:t>[Nombre 3]</w:t>
-            </w:r>
-          </w:p>
-        </w:tc>
-        <w:tc>
-          <w:tcPr>
-            <w:tcW w:type="dxa" w:w="2835"/>
-          </w:tcPr>
-          <w:p>
-            <w:pPr>
-              <w:spacing w:after="20"/>
-            </w:pPr>
-            <w:r/>
-            <w:r>
-              <w:rPr>
-                <w:sz w:val="18"/>
-              </w:rPr>
-              <w:t>Comunicador/a de negocio</w:t>
-            </w:r>
-          </w:p>
-        </w:tc>
-        <w:tc>
-          <w:tcPr>
-            <w:tcW w:type="dxa" w:w="3402"/>
-          </w:tcPr>
-          <w:p>
-            <w:pPr>
-              <w:spacing w:after="20"/>
-            </w:pPr>
-            <w:r/>
-            <w:r>
-              <w:rPr>
-                <w:sz w:val="18"/>
-              </w:rPr>
-              <w:t>Redacción de la recomendación a Gerencia</w:t>
-            </w:r>
-          </w:p>
-        </w:tc>
-      </w:tr>
-      <w:tr>
-        <w:tc>
-          <w:tcPr>
-            <w:tcW w:type="dxa" w:w="2381"/>
-          </w:tcPr>
-          <w:p>
-            <w:pPr>
-              <w:spacing w:after="20"/>
-            </w:pPr>
-            <w:r/>
-            <w:r>
-              <w:rPr>
-                <w:sz w:val="18"/>
-              </w:rPr>
-              <w:t>[Nombre 4]</w:t>
-            </w:r>
-          </w:p>
-        </w:tc>
-        <w:tc>
-          <w:tcPr>
-            <w:tcW w:type="dxa" w:w="2835"/>
-          </w:tcPr>
-          <w:p>
-            <w:pPr>
-              <w:spacing w:after="20"/>
-            </w:pPr>
-            <w:r/>
-            <w:r>
-              <w:rPr>
-                <w:sz w:val="18"/>
-              </w:rPr>
-              <w:t>Coordinador/a de calidad</w:t>
-            </w:r>
-          </w:p>
-        </w:tc>
-        <w:tc>
-          <w:tcPr>
-            <w:tcW w:type="dxa" w:w="3402"/>
-          </w:tcPr>
-          <w:p>
-            <w:pPr>
-              <w:spacing w:after="20"/>
-            </w:pPr>
-            <w:r/>
-            <w:r>
-              <w:rPr>
-                <w:sz w:val="18"/>
-              </w:rPr>
-              <w:t>Consistencia entre tareas y armado del documento</w:t>
+              <w:t>Recomendación a Gerencia, consistencia entre tareas y armado del documento</w:t>
             </w:r>
           </w:p>
         </w:tc>

</xml_diff>

<commit_message>
style(peml): apply Key institutional color palette across deliverables
</commit_message>
<xml_diff>
--- a/Reporte_TiendaExpres_Semana3.docx
+++ b/Reporte_TiendaExpres_Semana3.docx
@@ -6,7 +6,7 @@
       <w:r>
         <w:rPr>
           <w:b/>
-          <w:color w:val="C8952B"/>
+          <w:color w:val="9746FF"/>
           <w:sz w:val="18"/>
         </w:rPr>
         <w:t>KEY INSTITUTE · PEML — Probabilidad, Estadística y Machine Learning</w:t>
@@ -19,7 +19,7 @@
       <w:r>
         <w:rPr>
           <w:b/>
-          <w:color w:val="1B2A4A"/>
+          <w:color w:val="006FFF"/>
           <w:sz w:val="38"/>
         </w:rPr>
         <w:t>Caso TiendaExprés: distribuciones de probabilidad</w:t>
@@ -33,7 +33,7 @@
       </w:pPr>
       <w:r>
         <w:rPr>
-          <w:color w:val="5A606B"/>
+          <w:color w:val="7E7D8A"/>
           <w:sz w:val="19"/>
         </w:rPr>
         <w:t>Ejercicio de aplicación en equipo · Semana 3 · Ciclo Ago–Dic 2026</w:t>
@@ -57,7 +57,7 @@
         <w:tc>
           <w:tcPr>
             <w:tcW w:type="dxa" w:w="2041"/>
-            <w:shd w:val="clear" w:fill="1B2A4A"/>
+            <w:shd w:val="clear" w:fill="006FFF"/>
           </w:tcPr>
           <w:p>
             <w:r/>
@@ -74,7 +74,7 @@
         <w:tc>
           <w:tcPr>
             <w:tcW w:type="dxa" w:w="2835"/>
-            <w:shd w:val="clear" w:fill="1B2A4A"/>
+            <w:shd w:val="clear" w:fill="006FFF"/>
           </w:tcPr>
           <w:p>
             <w:r/>
@@ -91,7 +91,7 @@
         <w:tc>
           <w:tcPr>
             <w:tcW w:type="dxa" w:w="3742"/>
-            <w:shd w:val="clear" w:fill="1B2A4A"/>
+            <w:shd w:val="clear" w:fill="006FFF"/>
           </w:tcPr>
           <w:p>
             <w:r/>
@@ -313,7 +313,7 @@
         <w:tc>
           <w:tcPr>
             <w:tcW w:type="dxa" w:w="3175"/>
-            <w:shd w:val="clear" w:fill="1B2A4A"/>
+            <w:shd w:val="clear" w:fill="006FFF"/>
           </w:tcPr>
           <w:p>
             <w:r/>
@@ -330,7 +330,7 @@
         <w:tc>
           <w:tcPr>
             <w:tcW w:type="dxa" w:w="2721"/>
-            <w:shd w:val="clear" w:fill="1B2A4A"/>
+            <w:shd w:val="clear" w:fill="006FFF"/>
           </w:tcPr>
           <w:p>
             <w:r/>
@@ -347,7 +347,7 @@
         <w:tc>
           <w:tcPr>
             <w:tcW w:type="dxa" w:w="2721"/>
-            <w:shd w:val="clear" w:fill="1B2A4A"/>
+            <w:shd w:val="clear" w:fill="006FFF"/>
           </w:tcPr>
           <w:p>
             <w:r/>
@@ -832,7 +832,7 @@
         <w:tc>
           <w:tcPr>
             <w:tcW w:type="dxa" w:w="1020"/>
-            <w:shd w:val="clear" w:fill="1B2A4A"/>
+            <w:shd w:val="clear" w:fill="006FFF"/>
           </w:tcPr>
           <w:p>
             <w:r/>
@@ -849,7 +849,7 @@
         <w:tc>
           <w:tcPr>
             <w:tcW w:type="dxa" w:w="1361"/>
-            <w:shd w:val="clear" w:fill="1B2A4A"/>
+            <w:shd w:val="clear" w:fill="006FFF"/>
           </w:tcPr>
           <w:p>
             <w:r/>
@@ -866,7 +866,7 @@
         <w:tc>
           <w:tcPr>
             <w:tcW w:type="dxa" w:w="3402"/>
-            <w:shd w:val="clear" w:fill="1B2A4A"/>
+            <w:shd w:val="clear" w:fill="006FFF"/>
           </w:tcPr>
           <w:p>
             <w:r/>
@@ -883,7 +883,7 @@
         <w:tc>
           <w:tcPr>
             <w:tcW w:type="dxa" w:w="2268"/>
-            <w:shd w:val="clear" w:fill="1B2A4A"/>
+            <w:shd w:val="clear" w:fill="006FFF"/>
           </w:tcPr>
           <w:p>
             <w:r/>
@@ -1375,7 +1375,7 @@
       <w:r>
         <w:rPr>
           <w:i/>
-          <w:color w:val="5A606B"/>
+          <w:color w:val="7E7D8A"/>
           <w:sz w:val="17"/>
         </w:rPr>
         <w:t>Figura 1. Frecuencia observada en 30 días frente al modelo Binomial(12, 0.65).</w:t>
@@ -1422,7 +1422,7 @@
         <w:tc>
           <w:tcPr>
             <w:tcW w:type="dxa" w:w="2721"/>
-            <w:shd w:val="clear" w:fill="1B2A4A"/>
+            <w:shd w:val="clear" w:fill="006FFF"/>
           </w:tcPr>
           <w:p>
             <w:r/>
@@ -1439,7 +1439,7 @@
         <w:tc>
           <w:tcPr>
             <w:tcW w:type="dxa" w:w="2721"/>
-            <w:shd w:val="clear" w:fill="1B2A4A"/>
+            <w:shd w:val="clear" w:fill="006FFF"/>
           </w:tcPr>
           <w:p>
             <w:r/>
@@ -1456,7 +1456,7 @@
         <w:tc>
           <w:tcPr>
             <w:tcW w:type="dxa" w:w="3175"/>
-            <w:shd w:val="clear" w:fill="1B2A4A"/>
+            <w:shd w:val="clear" w:fill="006FFF"/>
           </w:tcPr>
           <w:p>
             <w:r/>
@@ -1742,7 +1742,7 @@
       <w:r>
         <w:rPr>
           <w:i/>
-          <w:color w:val="5A606B"/>
+          <w:color w:val="7E7D8A"/>
           <w:sz w:val="17"/>
         </w:rPr>
         <w:t>Figura 2. Convergencia de la probabilidad simulada hacia el valor teórico.</w:t>
@@ -1793,7 +1793,7 @@
         <w:tc>
           <w:tcPr>
             <w:tcW w:type="dxa" w:w="1587"/>
-            <w:shd w:val="clear" w:fill="1B2A4A"/>
+            <w:shd w:val="clear" w:fill="006FFF"/>
           </w:tcPr>
           <w:p>
             <w:r/>
@@ -1810,7 +1810,7 @@
         <w:tc>
           <w:tcPr>
             <w:tcW w:type="dxa" w:w="2268"/>
-            <w:shd w:val="clear" w:fill="1B2A4A"/>
+            <w:shd w:val="clear" w:fill="006FFF"/>
           </w:tcPr>
           <w:p>
             <w:r/>
@@ -1827,7 +1827,7 @@
         <w:tc>
           <w:tcPr>
             <w:tcW w:type="dxa" w:w="2154"/>
-            <w:shd w:val="clear" w:fill="1B2A4A"/>
+            <w:shd w:val="clear" w:fill="006FFF"/>
           </w:tcPr>
           <w:p>
             <w:r/>
@@ -1844,7 +1844,7 @@
         <w:tc>
           <w:tcPr>
             <w:tcW w:type="dxa" w:w="2608"/>
-            <w:shd w:val="clear" w:fill="1B2A4A"/>
+            <w:shd w:val="clear" w:fill="006FFF"/>
           </w:tcPr>
           <w:p>
             <w:r/>
@@ -2103,7 +2103,7 @@
         <w:tc>
           <w:tcPr>
             <w:tcW w:type="dxa" w:w="4535"/>
-            <w:shd w:val="clear" w:fill="1B2A4A"/>
+            <w:shd w:val="clear" w:fill="006FFF"/>
           </w:tcPr>
           <w:p>
             <w:r/>
@@ -2120,7 +2120,7 @@
         <w:tc>
           <w:tcPr>
             <w:tcW w:type="dxa" w:w="3515"/>
-            <w:shd w:val="clear" w:fill="1B2A4A"/>
+            <w:shd w:val="clear" w:fill="006FFF"/>
           </w:tcPr>
           <w:p>
             <w:r/>
@@ -2441,7 +2441,7 @@
       <w:r>
         <w:rPr>
           <w:i/>
-          <w:color w:val="5A606B"/>
+          <w:color w:val="7E7D8A"/>
           <w:sz w:val="17"/>
         </w:rPr>
         <w:t>Figura 3. Diagrama de caja del Dataset B con los límites del método IQR.</w:t>
@@ -2488,7 +2488,7 @@
         <w:tc>
           <w:tcPr>
             <w:tcW w:type="dxa" w:w="3061"/>
-            <w:shd w:val="clear" w:fill="1B2A4A"/>
+            <w:shd w:val="clear" w:fill="006FFF"/>
           </w:tcPr>
           <w:p>
             <w:r/>
@@ -2505,7 +2505,7 @@
         <w:tc>
           <w:tcPr>
             <w:tcW w:type="dxa" w:w="2494"/>
-            <w:shd w:val="clear" w:fill="1B2A4A"/>
+            <w:shd w:val="clear" w:fill="006FFF"/>
           </w:tcPr>
           <w:p>
             <w:r/>
@@ -2522,7 +2522,7 @@
         <w:tc>
           <w:tcPr>
             <w:tcW w:type="dxa" w:w="2494"/>
-            <w:shd w:val="clear" w:fill="1B2A4A"/>
+            <w:shd w:val="clear" w:fill="006FFF"/>
           </w:tcPr>
           <w:p>
             <w:r/>
@@ -2833,7 +2833,7 @@
       <w:r>
         <w:rPr>
           <w:b/>
-          <w:color w:val="1B2A4A"/>
+          <w:color w:val="006FFF"/>
           <w:sz w:val="22"/>
         </w:rPr>
         <w:t>X = μ + z · σ = 31.7368 + 1.2816 × 4.6999 = 37.76 minutos</w:t>
@@ -2861,7 +2861,7 @@
         <w:tc>
           <w:tcPr>
             <w:tcW w:type="dxa" w:w="1928"/>
-            <w:shd w:val="clear" w:fill="1B2A4A"/>
+            <w:shd w:val="clear" w:fill="006FFF"/>
           </w:tcPr>
           <w:p>
             <w:r/>
@@ -2878,7 +2878,7 @@
         <w:tc>
           <w:tcPr>
             <w:tcW w:type="dxa" w:w="2268"/>
-            <w:shd w:val="clear" w:fill="1B2A4A"/>
+            <w:shd w:val="clear" w:fill="006FFF"/>
           </w:tcPr>
           <w:p>
             <w:r/>
@@ -2895,7 +2895,7 @@
         <w:tc>
           <w:tcPr>
             <w:tcW w:type="dxa" w:w="2154"/>
-            <w:shd w:val="clear" w:fill="1B2A4A"/>
+            <w:shd w:val="clear" w:fill="006FFF"/>
           </w:tcPr>
           <w:p>
             <w:r/>
@@ -2912,7 +2912,7 @@
         <w:tc>
           <w:tcPr>
             <w:tcW w:type="dxa" w:w="2268"/>
-            <w:shd w:val="clear" w:fill="1B2A4A"/>
+            <w:shd w:val="clear" w:fill="006FFF"/>
           </w:tcPr>
           <w:p>
             <w:r/>
@@ -3266,7 +3266,7 @@
       <w:r>
         <w:rPr>
           <w:i/>
-          <w:color w:val="5A606B"/>
+          <w:color w:val="7E7D8A"/>
           <w:sz w:val="17"/>
         </w:rPr>
         <w:t>Figura 4. Histograma de tiempos de entrega, curva normal ajustada y garantía propuesta.</w:t>
@@ -3399,7 +3399,7 @@
     </w:pPr>
     <w:r>
       <w:rPr>
-        <w:color w:val="5A606B"/>
+        <w:color w:val="7E7D8A"/>
         <w:sz w:val="16"/>
       </w:rPr>
       <w:t xml:space="preserve">PEML · Key Institute · Caso TiendaExprés · Semana 3    |    Página </w:t>
@@ -3842,7 +3842,7 @@
       <w:rFonts w:asciiTheme="majorHAnsi" w:eastAsiaTheme="majorEastAsia" w:hAnsiTheme="majorHAnsi" w:cstheme="majorBidi" w:ascii="Calibri" w:hAnsi="Calibri"/>
       <w:b/>
       <w:bCs/>
-      <w:color w:val="1B2A4A"/>
+      <w:color w:val="006FFF"/>
       <w:sz w:val="25"/>
       <w:szCs w:val="28"/>
     </w:rPr>
@@ -3866,7 +3866,7 @@
       <w:rFonts w:asciiTheme="majorHAnsi" w:eastAsiaTheme="majorEastAsia" w:hAnsiTheme="majorHAnsi" w:cstheme="majorBidi" w:ascii="Calibri" w:hAnsi="Calibri"/>
       <w:b/>
       <w:bCs/>
-      <w:color w:val="1B2A4A"/>
+      <w:color w:val="000000"/>
       <w:sz w:val="21"/>
       <w:szCs w:val="26"/>
     </w:rPr>

</xml_diff>

<commit_message>
docs(peml): append full Python source listing to week 3 report
</commit_message>
<xml_diff>
--- a/Reporte_TiendaExpres_Semana3.docx
+++ b/Reporte_TiendaExpres_Semana3.docx
@@ -3379,6 +3379,4301 @@
         <w:t>Documentación del módulo statistics de la librería estándar de Python (funciones mean, pvariance, pstdev y NormalDist).</w:t>
       </w:r>
     </w:p>
+    <w:p>
+      <w:r>
+        <w:br w:type="page"/>
+      </w:r>
+    </w:p>
+    <w:p>
+      <w:pPr>
+        <w:pStyle w:val="Heading1"/>
+      </w:pPr>
+      <w:r>
+        <w:t>Anexo A · Código Python completo</w:t>
+      </w:r>
+    </w:p>
+    <w:p>
+      <w:r>
+        <w:t>Listado íntegro de tiendaexpres_semana3.py, el script que reproduce las seis tareas e imprime todas las cifras citadas en este reporte. Se numeran las líneas para poder referenciar cálculos concretos desde el cuerpo del documento.</w:t>
+      </w:r>
+    </w:p>
+    <w:p>
+      <w:pPr>
+        <w:spacing w:before="0" w:after="0" w:line="240" w:lineRule="auto"/>
+      </w:pPr>
+      <w:r>
+        <w:rPr>
+          <w:rFonts w:ascii="Consolas" w:hAnsi="Consolas"/>
+          <w:color w:val="000000"/>
+          <w:sz w:val="14"/>
+        </w:rPr>
+        <w:t xml:space="preserve">  1  """</w:t>
+      </w:r>
+    </w:p>
+    <w:p>
+      <w:pPr>
+        <w:spacing w:before="0" w:after="0" w:line="240" w:lineRule="auto"/>
+      </w:pPr>
+      <w:r>
+        <w:rPr>
+          <w:rFonts w:ascii="Consolas" w:hAnsi="Consolas"/>
+          <w:color w:val="000000"/>
+          <w:sz w:val="14"/>
+        </w:rPr>
+        <w:t xml:space="preserve">  2  PEML - Key Institute | Semana 3 - Distribuciones de probabilidad</w:t>
+      </w:r>
+    </w:p>
+    <w:p>
+      <w:pPr>
+        <w:spacing w:before="0" w:after="0" w:line="240" w:lineRule="auto"/>
+      </w:pPr>
+      <w:r>
+        <w:rPr>
+          <w:rFonts w:ascii="Consolas" w:hAnsi="Consolas"/>
+          <w:color w:val="000000"/>
+          <w:sz w:val="14"/>
+        </w:rPr>
+        <w:t xml:space="preserve">  3  Caso TiendaExpres: decision de cajero adicional y garantia de tiempo de entrega.</w:t>
+      </w:r>
+    </w:p>
+    <w:p>
+      <w:pPr>
+        <w:spacing w:before="0" w:after="0" w:line="240" w:lineRule="auto"/>
+      </w:pPr>
+      <w:r>
+        <w:rPr>
+          <w:rFonts w:ascii="Consolas" w:hAnsi="Consolas"/>
+          <w:color w:val="000000"/>
+          <w:sz w:val="14"/>
+        </w:rPr>
+        <w:t xml:space="preserve">  4  </w:t>
+      </w:r>
+    </w:p>
+    <w:p>
+      <w:pPr>
+        <w:spacing w:before="0" w:after="0" w:line="240" w:lineRule="auto"/>
+      </w:pPr>
+      <w:r>
+        <w:rPr>
+          <w:rFonts w:ascii="Consolas" w:hAnsi="Consolas"/>
+          <w:color w:val="000000"/>
+          <w:sz w:val="14"/>
+        </w:rPr>
+        <w:t xml:space="preserve">  5  Ejecutar:  python3 tiendaexpres_semana3.py</w:t>
+      </w:r>
+    </w:p>
+    <w:p>
+      <w:pPr>
+        <w:spacing w:before="0" w:after="0" w:line="240" w:lineRule="auto"/>
+      </w:pPr>
+      <w:r>
+        <w:rPr>
+          <w:rFonts w:ascii="Consolas" w:hAnsi="Consolas"/>
+          <w:color w:val="000000"/>
+          <w:sz w:val="14"/>
+        </w:rPr>
+        <w:t xml:space="preserve">  6  Dependencias: solo libreria estandar (math, random, statistics).</w:t>
+      </w:r>
+    </w:p>
+    <w:p>
+      <w:pPr>
+        <w:spacing w:before="0" w:after="0" w:line="240" w:lineRule="auto"/>
+      </w:pPr>
+      <w:r>
+        <w:rPr>
+          <w:rFonts w:ascii="Consolas" w:hAnsi="Consolas"/>
+          <w:color w:val="000000"/>
+          <w:sz w:val="14"/>
+        </w:rPr>
+        <w:t xml:space="preserve">  7                matplotlib es opcional y solo se usa para exportar los graficos.</w:t>
+      </w:r>
+    </w:p>
+    <w:p>
+      <w:pPr>
+        <w:spacing w:before="0" w:after="0" w:line="240" w:lineRule="auto"/>
+      </w:pPr>
+      <w:r>
+        <w:rPr>
+          <w:rFonts w:ascii="Consolas" w:hAnsi="Consolas"/>
+          <w:color w:val="000000"/>
+          <w:sz w:val="14"/>
+        </w:rPr>
+        <w:t xml:space="preserve">  8  """</w:t>
+      </w:r>
+    </w:p>
+    <w:p>
+      <w:pPr>
+        <w:spacing w:before="0" w:after="0" w:line="240" w:lineRule="auto"/>
+      </w:pPr>
+      <w:r>
+        <w:rPr>
+          <w:rFonts w:ascii="Consolas" w:hAnsi="Consolas"/>
+          <w:color w:val="000000"/>
+          <w:sz w:val="14"/>
+        </w:rPr>
+        <w:t xml:space="preserve">  9  </w:t>
+      </w:r>
+    </w:p>
+    <w:p>
+      <w:pPr>
+        <w:spacing w:before="0" w:after="0" w:line="240" w:lineRule="auto"/>
+      </w:pPr>
+      <w:r>
+        <w:rPr>
+          <w:rFonts w:ascii="Consolas" w:hAnsi="Consolas"/>
+          <w:color w:val="000000"/>
+          <w:sz w:val="14"/>
+        </w:rPr>
+        <w:t xml:space="preserve"> 10  import math</w:t>
+      </w:r>
+    </w:p>
+    <w:p>
+      <w:pPr>
+        <w:spacing w:before="0" w:after="0" w:line="240" w:lineRule="auto"/>
+      </w:pPr>
+      <w:r>
+        <w:rPr>
+          <w:rFonts w:ascii="Consolas" w:hAnsi="Consolas"/>
+          <w:color w:val="000000"/>
+          <w:sz w:val="14"/>
+        </w:rPr>
+        <w:t xml:space="preserve"> 11  import random</w:t>
+      </w:r>
+    </w:p>
+    <w:p>
+      <w:pPr>
+        <w:spacing w:before="0" w:after="0" w:line="240" w:lineRule="auto"/>
+      </w:pPr>
+      <w:r>
+        <w:rPr>
+          <w:rFonts w:ascii="Consolas" w:hAnsi="Consolas"/>
+          <w:color w:val="000000"/>
+          <w:sz w:val="14"/>
+        </w:rPr>
+        <w:t xml:space="preserve"> 12  import statistics as st</w:t>
+      </w:r>
+    </w:p>
+    <w:p>
+      <w:pPr>
+        <w:spacing w:before="0" w:after="0" w:line="240" w:lineRule="auto"/>
+      </w:pPr>
+      <w:r>
+        <w:rPr>
+          <w:rFonts w:ascii="Consolas" w:hAnsi="Consolas"/>
+          <w:color w:val="000000"/>
+          <w:sz w:val="14"/>
+        </w:rPr>
+        <w:t xml:space="preserve"> 13  from collections import Counter</w:t>
+      </w:r>
+    </w:p>
+    <w:p>
+      <w:pPr>
+        <w:spacing w:before="0" w:after="0" w:line="240" w:lineRule="auto"/>
+      </w:pPr>
+      <w:r>
+        <w:rPr>
+          <w:rFonts w:ascii="Consolas" w:hAnsi="Consolas"/>
+          <w:color w:val="000000"/>
+          <w:sz w:val="14"/>
+        </w:rPr>
+        <w:t xml:space="preserve"> 14  </w:t>
+      </w:r>
+    </w:p>
+    <w:p>
+      <w:pPr>
+        <w:spacing w:before="0" w:after="0" w:line="240" w:lineRule="auto"/>
+      </w:pPr>
+      <w:r>
+        <w:rPr>
+          <w:rFonts w:ascii="Consolas" w:hAnsi="Consolas"/>
+          <w:color w:val="000000"/>
+          <w:sz w:val="14"/>
+        </w:rPr>
+        <w:t xml:space="preserve"> 15  SEMILLA = 42  # fija la simulacion Monte Carlo para que los resultados sean reproducibles</w:t>
+      </w:r>
+    </w:p>
+    <w:p>
+      <w:pPr>
+        <w:spacing w:before="0" w:after="0" w:line="240" w:lineRule="auto"/>
+      </w:pPr>
+      <w:r>
+        <w:rPr>
+          <w:rFonts w:ascii="Consolas" w:hAnsi="Consolas"/>
+          <w:color w:val="000000"/>
+          <w:sz w:val="14"/>
+        </w:rPr>
+        <w:t xml:space="preserve"> 16  </w:t>
+      </w:r>
+    </w:p>
+    <w:p>
+      <w:pPr>
+        <w:spacing w:before="0" w:after="0" w:line="240" w:lineRule="auto"/>
+      </w:pPr>
+      <w:r>
+        <w:rPr>
+          <w:rFonts w:ascii="Consolas" w:hAnsi="Consolas"/>
+          <w:color w:val="000000"/>
+          <w:sz w:val="14"/>
+        </w:rPr>
+        <w:t xml:space="preserve"> 17  # =====================================================================</w:t>
+      </w:r>
+    </w:p>
+    <w:p>
+      <w:pPr>
+        <w:spacing w:before="0" w:after="0" w:line="240" w:lineRule="auto"/>
+      </w:pPr>
+      <w:r>
+        <w:rPr>
+          <w:rFonts w:ascii="Consolas" w:hAnsi="Consolas"/>
+          <w:color w:val="000000"/>
+          <w:sz w:val="14"/>
+        </w:rPr>
+        <w:t xml:space="preserve"> 18  # DATOS PROPORCIONADOS POR GERENCIA (Seccion 3 de la guia). No se modifican.</w:t>
+      </w:r>
+    </w:p>
+    <w:p>
+      <w:pPr>
+        <w:spacing w:before="0" w:after="0" w:line="240" w:lineRule="auto"/>
+      </w:pPr>
+      <w:r>
+        <w:rPr>
+          <w:rFonts w:ascii="Consolas" w:hAnsi="Consolas"/>
+          <w:color w:val="000000"/>
+          <w:sz w:val="14"/>
+        </w:rPr>
+        <w:t xml:space="preserve"> 19  # =====================================================================</w:t>
+      </w:r>
+    </w:p>
+    <w:p>
+      <w:pPr>
+        <w:spacing w:before="0" w:after="0" w:line="240" w:lineRule="auto"/>
+      </w:pPr>
+      <w:r>
+        <w:rPr>
+          <w:rFonts w:ascii="Consolas" w:hAnsi="Consolas"/>
+          <w:color w:val="000000"/>
+          <w:sz w:val="14"/>
+        </w:rPr>
+        <w:t xml:space="preserve"> 20  </w:t>
+      </w:r>
+    </w:p>
+    <w:p>
+      <w:pPr>
+        <w:spacing w:before="0" w:after="0" w:line="240" w:lineRule="auto"/>
+      </w:pPr>
+      <w:r>
+        <w:rPr>
+          <w:rFonts w:ascii="Consolas" w:hAnsi="Consolas"/>
+          <w:color w:val="000000"/>
+          <w:sz w:val="14"/>
+        </w:rPr>
+        <w:t xml:space="preserve"> 21  compras_completadas = [9, 9, 7, 9, 10, 7, 8, 10, 7, 8, 7, 7, 10, 9, 9,</w:t>
+      </w:r>
+    </w:p>
+    <w:p>
+      <w:pPr>
+        <w:spacing w:before="0" w:after="0" w:line="240" w:lineRule="auto"/>
+      </w:pPr>
+      <w:r>
+        <w:rPr>
+          <w:rFonts w:ascii="Consolas" w:hAnsi="Consolas"/>
+          <w:color w:val="000000"/>
+          <w:sz w:val="14"/>
+        </w:rPr>
+        <w:t xml:space="preserve"> 22                         8, 5, 8, 8, 9, 8, 7, 5, 9, 9, 6, 5, 4, 8, 8]</w:t>
+      </w:r>
+    </w:p>
+    <w:p>
+      <w:pPr>
+        <w:spacing w:before="0" w:after="0" w:line="240" w:lineRule="auto"/>
+      </w:pPr>
+      <w:r>
+        <w:rPr>
+          <w:rFonts w:ascii="Consolas" w:hAnsi="Consolas"/>
+          <w:color w:val="000000"/>
+          <w:sz w:val="14"/>
+        </w:rPr>
+        <w:t xml:space="preserve"> 23  n_clientes_por_turno = 12</w:t>
+      </w:r>
+    </w:p>
+    <w:p>
+      <w:pPr>
+        <w:spacing w:before="0" w:after="0" w:line="240" w:lineRule="auto"/>
+      </w:pPr>
+      <w:r>
+        <w:rPr>
+          <w:rFonts w:ascii="Consolas" w:hAnsi="Consolas"/>
+          <w:color w:val="000000"/>
+          <w:sz w:val="14"/>
+        </w:rPr>
+        <w:t xml:space="preserve"> 24  tasa_historica_conversion = 0.65  # 65%, dato de referencia de Gerencia</w:t>
+      </w:r>
+    </w:p>
+    <w:p>
+      <w:pPr>
+        <w:spacing w:before="0" w:after="0" w:line="240" w:lineRule="auto"/>
+      </w:pPr>
+      <w:r>
+        <w:rPr>
+          <w:rFonts w:ascii="Consolas" w:hAnsi="Consolas"/>
+          <w:color w:val="000000"/>
+          <w:sz w:val="14"/>
+        </w:rPr>
+        <w:t xml:space="preserve"> 25  </w:t>
+      </w:r>
+    </w:p>
+    <w:p>
+      <w:pPr>
+        <w:spacing w:before="0" w:after="0" w:line="240" w:lineRule="auto"/>
+      </w:pPr>
+      <w:r>
+        <w:rPr>
+          <w:rFonts w:ascii="Consolas" w:hAnsi="Consolas"/>
+          <w:color w:val="000000"/>
+          <w:sz w:val="14"/>
+        </w:rPr>
+        <w:t xml:space="preserve"> 26  tiempos_entrega = [30, 35, 26, 32, 22, 22, 34, 29, 38, 35, 28, 30, 39, 35, 9,</w:t>
+      </w:r>
+    </w:p>
+    <w:p>
+      <w:pPr>
+        <w:spacing w:before="0" w:after="0" w:line="240" w:lineRule="auto"/>
+      </w:pPr>
+      <w:r>
+        <w:rPr>
+          <w:rFonts w:ascii="Consolas" w:hAnsi="Consolas"/>
+          <w:color w:val="000000"/>
+          <w:sz w:val="14"/>
+        </w:rPr>
+        <w:t xml:space="preserve"> 27                     34, 31, 37, 42, 30, 28, 36, 35, 35, 33, 34, 28, 22, 33, 27,</w:t>
+      </w:r>
+    </w:p>
+    <w:p>
+      <w:pPr>
+        <w:spacing w:before="0" w:after="0" w:line="240" w:lineRule="auto"/>
+      </w:pPr>
+      <w:r>
+        <w:rPr>
+          <w:rFonts w:ascii="Consolas" w:hAnsi="Consolas"/>
+          <w:color w:val="000000"/>
+          <w:sz w:val="14"/>
+        </w:rPr>
+        <w:t xml:space="preserve"> 28                     31, 31, 33, 35, 29, 28, 61, 26, 39, 34]</w:t>
+      </w:r>
+    </w:p>
+    <w:p>
+      <w:pPr>
+        <w:spacing w:before="0" w:after="0" w:line="240" w:lineRule="auto"/>
+      </w:pPr>
+      <w:r>
+        <w:rPr>
+          <w:rFonts w:ascii="Consolas" w:hAnsi="Consolas"/>
+          <w:color w:val="000000"/>
+          <w:sz w:val="14"/>
+        </w:rPr>
+        <w:t xml:space="preserve"> 29  </w:t>
+      </w:r>
+    </w:p>
+    <w:p>
+      <w:pPr>
+        <w:spacing w:before="0" w:after="0" w:line="240" w:lineRule="auto"/>
+      </w:pPr>
+      <w:r>
+        <w:rPr>
+          <w:rFonts w:ascii="Consolas" w:hAnsi="Consolas"/>
+          <w:color w:val="000000"/>
+          <w:sz w:val="14"/>
+        </w:rPr>
+        <w:t xml:space="preserve"> 30  </w:t>
+      </w:r>
+    </w:p>
+    <w:p>
+      <w:pPr>
+        <w:spacing w:before="0" w:after="0" w:line="240" w:lineRule="auto"/>
+      </w:pPr>
+      <w:r>
+        <w:rPr>
+          <w:rFonts w:ascii="Consolas" w:hAnsi="Consolas"/>
+          <w:color w:val="000000"/>
+          <w:sz w:val="14"/>
+        </w:rPr>
+        <w:t xml:space="preserve"> 31  def titulo(texto):</w:t>
+      </w:r>
+    </w:p>
+    <w:p>
+      <w:pPr>
+        <w:spacing w:before="0" w:after="0" w:line="240" w:lineRule="auto"/>
+      </w:pPr>
+      <w:r>
+        <w:rPr>
+          <w:rFonts w:ascii="Consolas" w:hAnsi="Consolas"/>
+          <w:color w:val="000000"/>
+          <w:sz w:val="14"/>
+        </w:rPr>
+        <w:t xml:space="preserve"> 32      print("\n" + "=" * 68)</w:t>
+      </w:r>
+    </w:p>
+    <w:p>
+      <w:pPr>
+        <w:spacing w:before="0" w:after="0" w:line="240" w:lineRule="auto"/>
+      </w:pPr>
+      <w:r>
+        <w:rPr>
+          <w:rFonts w:ascii="Consolas" w:hAnsi="Consolas"/>
+          <w:color w:val="000000"/>
+          <w:sz w:val="14"/>
+        </w:rPr>
+        <w:t xml:space="preserve"> 33      print(texto)</w:t>
+      </w:r>
+    </w:p>
+    <w:p>
+      <w:pPr>
+        <w:spacing w:before="0" w:after="0" w:line="240" w:lineRule="auto"/>
+      </w:pPr>
+      <w:r>
+        <w:rPr>
+          <w:rFonts w:ascii="Consolas" w:hAnsi="Consolas"/>
+          <w:color w:val="000000"/>
+          <w:sz w:val="14"/>
+        </w:rPr>
+        <w:t xml:space="preserve"> 34      print("=" * 68)</w:t>
+      </w:r>
+    </w:p>
+    <w:p>
+      <w:pPr>
+        <w:spacing w:before="0" w:after="0" w:line="240" w:lineRule="auto"/>
+      </w:pPr>
+      <w:r>
+        <w:rPr>
+          <w:rFonts w:ascii="Consolas" w:hAnsi="Consolas"/>
+          <w:color w:val="000000"/>
+          <w:sz w:val="14"/>
+        </w:rPr>
+        <w:t xml:space="preserve"> 35  </w:t>
+      </w:r>
+    </w:p>
+    <w:p>
+      <w:pPr>
+        <w:spacing w:before="0" w:after="0" w:line="240" w:lineRule="auto"/>
+      </w:pPr>
+      <w:r>
+        <w:rPr>
+          <w:rFonts w:ascii="Consolas" w:hAnsi="Consolas"/>
+          <w:color w:val="000000"/>
+          <w:sz w:val="14"/>
+        </w:rPr>
+        <w:t xml:space="preserve"> 36  </w:t>
+      </w:r>
+    </w:p>
+    <w:p>
+      <w:pPr>
+        <w:spacing w:before="0" w:after="0" w:line="240" w:lineRule="auto"/>
+      </w:pPr>
+      <w:r>
+        <w:rPr>
+          <w:rFonts w:ascii="Consolas" w:hAnsi="Consolas"/>
+          <w:color w:val="000000"/>
+          <w:sz w:val="14"/>
+        </w:rPr>
+        <w:t xml:space="preserve"> 37  # =====================================================================</w:t>
+      </w:r>
+    </w:p>
+    <w:p>
+      <w:pPr>
+        <w:spacing w:before="0" w:after="0" w:line="240" w:lineRule="auto"/>
+      </w:pPr>
+      <w:r>
+        <w:rPr>
+          <w:rFonts w:ascii="Consolas" w:hAnsi="Consolas"/>
+          <w:color w:val="000000"/>
+          <w:sz w:val="14"/>
+        </w:rPr>
+        <w:t xml:space="preserve"> 38  # TAREA 1 - EXPLORACION DE DATOS</w:t>
+      </w:r>
+    </w:p>
+    <w:p>
+      <w:pPr>
+        <w:spacing w:before="0" w:after="0" w:line="240" w:lineRule="auto"/>
+      </w:pPr>
+      <w:r>
+        <w:rPr>
+          <w:rFonts w:ascii="Consolas" w:hAnsi="Consolas"/>
+          <w:color w:val="000000"/>
+          <w:sz w:val="14"/>
+        </w:rPr>
+        <w:t xml:space="preserve"> 39  # =====================================================================</w:t>
+      </w:r>
+    </w:p>
+    <w:p>
+      <w:pPr>
+        <w:spacing w:before="0" w:after="0" w:line="240" w:lineRule="auto"/>
+      </w:pPr>
+      <w:r>
+        <w:rPr>
+          <w:rFonts w:ascii="Consolas" w:hAnsi="Consolas"/>
+          <w:color w:val="000000"/>
+          <w:sz w:val="14"/>
+        </w:rPr>
+        <w:t xml:space="preserve"> 40  </w:t>
+      </w:r>
+    </w:p>
+    <w:p>
+      <w:pPr>
+        <w:spacing w:before="0" w:after="0" w:line="240" w:lineRule="auto"/>
+      </w:pPr>
+      <w:r>
+        <w:rPr>
+          <w:rFonts w:ascii="Consolas" w:hAnsi="Consolas"/>
+          <w:color w:val="000000"/>
+          <w:sz w:val="14"/>
+        </w:rPr>
+        <w:t xml:space="preserve"> 41  def descriptivos(datos, nombre, unidad=""):</w:t>
+      </w:r>
+    </w:p>
+    <w:p>
+      <w:pPr>
+        <w:spacing w:before="0" w:after="0" w:line="240" w:lineRule="auto"/>
+      </w:pPr>
+      <w:r>
+        <w:rPr>
+          <w:rFonts w:ascii="Consolas" w:hAnsi="Consolas"/>
+          <w:color w:val="000000"/>
+          <w:sz w:val="14"/>
+        </w:rPr>
+        <w:t xml:space="preserve"> 42      """Media, varianza y desviacion estandar. Se reportan las dos versiones:</w:t>
+      </w:r>
+    </w:p>
+    <w:p>
+      <w:pPr>
+        <w:spacing w:before="0" w:after="0" w:line="240" w:lineRule="auto"/>
+      </w:pPr>
+      <w:r>
+        <w:rPr>
+          <w:rFonts w:ascii="Consolas" w:hAnsi="Consolas"/>
+          <w:color w:val="000000"/>
+          <w:sz w:val="14"/>
+        </w:rPr>
+        <w:t xml:space="preserve"> 43      poblacional (divide entre N) y muestral (divide entre N-1)."""</w:t>
+      </w:r>
+    </w:p>
+    <w:p>
+      <w:pPr>
+        <w:spacing w:before="0" w:after="0" w:line="240" w:lineRule="auto"/>
+      </w:pPr>
+      <w:r>
+        <w:rPr>
+          <w:rFonts w:ascii="Consolas" w:hAnsi="Consolas"/>
+          <w:color w:val="000000"/>
+          <w:sz w:val="14"/>
+        </w:rPr>
+        <w:t xml:space="preserve"> 44      n = len(datos)</w:t>
+      </w:r>
+    </w:p>
+    <w:p>
+      <w:pPr>
+        <w:spacing w:before="0" w:after="0" w:line="240" w:lineRule="auto"/>
+      </w:pPr>
+      <w:r>
+        <w:rPr>
+          <w:rFonts w:ascii="Consolas" w:hAnsi="Consolas"/>
+          <w:color w:val="000000"/>
+          <w:sz w:val="14"/>
+        </w:rPr>
+        <w:t xml:space="preserve"> 45      media = st.mean(datos)</w:t>
+      </w:r>
+    </w:p>
+    <w:p>
+      <w:pPr>
+        <w:spacing w:before="0" w:after="0" w:line="240" w:lineRule="auto"/>
+      </w:pPr>
+      <w:r>
+        <w:rPr>
+          <w:rFonts w:ascii="Consolas" w:hAnsi="Consolas"/>
+          <w:color w:val="000000"/>
+          <w:sz w:val="14"/>
+        </w:rPr>
+        <w:t xml:space="preserve"> 46      var_pob, sd_pob = st.pvariance(datos), st.pstdev(datos)</w:t>
+      </w:r>
+    </w:p>
+    <w:p>
+      <w:pPr>
+        <w:spacing w:before="0" w:after="0" w:line="240" w:lineRule="auto"/>
+      </w:pPr>
+      <w:r>
+        <w:rPr>
+          <w:rFonts w:ascii="Consolas" w:hAnsi="Consolas"/>
+          <w:color w:val="000000"/>
+          <w:sz w:val="14"/>
+        </w:rPr>
+        <w:t xml:space="preserve"> 47      var_mue, sd_mue = st.variance(datos), st.stdev(datos)</w:t>
+      </w:r>
+    </w:p>
+    <w:p>
+      <w:pPr>
+        <w:spacing w:before="0" w:after="0" w:line="240" w:lineRule="auto"/>
+      </w:pPr>
+      <w:r>
+        <w:rPr>
+          <w:rFonts w:ascii="Consolas" w:hAnsi="Consolas"/>
+          <w:color w:val="000000"/>
+          <w:sz w:val="14"/>
+        </w:rPr>
+        <w:t xml:space="preserve"> 48      print(f"\n{nombre}  (n = {n})")</w:t>
+      </w:r>
+    </w:p>
+    <w:p>
+      <w:pPr>
+        <w:spacing w:before="0" w:after="0" w:line="240" w:lineRule="auto"/>
+      </w:pPr>
+      <w:r>
+        <w:rPr>
+          <w:rFonts w:ascii="Consolas" w:hAnsi="Consolas"/>
+          <w:color w:val="000000"/>
+          <w:sz w:val="14"/>
+        </w:rPr>
+        <w:t xml:space="preserve"> 49      print(f"  Media                  = {media:.4f} {unidad}")</w:t>
+      </w:r>
+    </w:p>
+    <w:p>
+      <w:pPr>
+        <w:spacing w:before="0" w:after="0" w:line="240" w:lineRule="auto"/>
+      </w:pPr>
+      <w:r>
+        <w:rPr>
+          <w:rFonts w:ascii="Consolas" w:hAnsi="Consolas"/>
+          <w:color w:val="000000"/>
+          <w:sz w:val="14"/>
+        </w:rPr>
+        <w:t xml:space="preserve"> 50      print(f"  Mediana                = {st.median(datos):.4f} {unidad}")</w:t>
+      </w:r>
+    </w:p>
+    <w:p>
+      <w:pPr>
+        <w:spacing w:before="0" w:after="0" w:line="240" w:lineRule="auto"/>
+      </w:pPr>
+      <w:r>
+        <w:rPr>
+          <w:rFonts w:ascii="Consolas" w:hAnsi="Consolas"/>
+          <w:color w:val="000000"/>
+          <w:sz w:val="14"/>
+        </w:rPr>
+        <w:t xml:space="preserve"> 51      print(f"  Varianza poblacional   = {var_pob:.4f}")</w:t>
+      </w:r>
+    </w:p>
+    <w:p>
+      <w:pPr>
+        <w:spacing w:before="0" w:after="0" w:line="240" w:lineRule="auto"/>
+      </w:pPr>
+      <w:r>
+        <w:rPr>
+          <w:rFonts w:ascii="Consolas" w:hAnsi="Consolas"/>
+          <w:color w:val="000000"/>
+          <w:sz w:val="14"/>
+        </w:rPr>
+        <w:t xml:space="preserve"> 52      print(f"  Desv. est. poblacional = {sd_pob:.4f} {unidad}")</w:t>
+      </w:r>
+    </w:p>
+    <w:p>
+      <w:pPr>
+        <w:spacing w:before="0" w:after="0" w:line="240" w:lineRule="auto"/>
+      </w:pPr>
+      <w:r>
+        <w:rPr>
+          <w:rFonts w:ascii="Consolas" w:hAnsi="Consolas"/>
+          <w:color w:val="000000"/>
+          <w:sz w:val="14"/>
+        </w:rPr>
+        <w:t xml:space="preserve"> 53      print(f"  Varianza muestral      = {var_mue:.4f}")</w:t>
+      </w:r>
+    </w:p>
+    <w:p>
+      <w:pPr>
+        <w:spacing w:before="0" w:after="0" w:line="240" w:lineRule="auto"/>
+      </w:pPr>
+      <w:r>
+        <w:rPr>
+          <w:rFonts w:ascii="Consolas" w:hAnsi="Consolas"/>
+          <w:color w:val="000000"/>
+          <w:sz w:val="14"/>
+        </w:rPr>
+        <w:t xml:space="preserve"> 54      print(f"  Desv. est. muestral    = {sd_mue:.4f} {unidad}")</w:t>
+      </w:r>
+    </w:p>
+    <w:p>
+      <w:pPr>
+        <w:spacing w:before="0" w:after="0" w:line="240" w:lineRule="auto"/>
+      </w:pPr>
+      <w:r>
+        <w:rPr>
+          <w:rFonts w:ascii="Consolas" w:hAnsi="Consolas"/>
+          <w:color w:val="000000"/>
+          <w:sz w:val="14"/>
+        </w:rPr>
+        <w:t xml:space="preserve"> 55      return {"n": n, "media": media, "var_pob": var_pob, "sd_pob": sd_pob,</w:t>
+      </w:r>
+    </w:p>
+    <w:p>
+      <w:pPr>
+        <w:spacing w:before="0" w:after="0" w:line="240" w:lineRule="auto"/>
+      </w:pPr>
+      <w:r>
+        <w:rPr>
+          <w:rFonts w:ascii="Consolas" w:hAnsi="Consolas"/>
+          <w:color w:val="000000"/>
+          <w:sz w:val="14"/>
+        </w:rPr>
+        <w:t xml:space="preserve"> 56              "var_mue": var_mue, "sd_mue": sd_mue}</w:t>
+      </w:r>
+    </w:p>
+    <w:p>
+      <w:pPr>
+        <w:spacing w:before="0" w:after="0" w:line="240" w:lineRule="auto"/>
+      </w:pPr>
+      <w:r>
+        <w:rPr>
+          <w:rFonts w:ascii="Consolas" w:hAnsi="Consolas"/>
+          <w:color w:val="000000"/>
+          <w:sz w:val="14"/>
+        </w:rPr>
+        <w:t xml:space="preserve"> 57  </w:t>
+      </w:r>
+    </w:p>
+    <w:p>
+      <w:pPr>
+        <w:spacing w:before="0" w:after="0" w:line="240" w:lineRule="auto"/>
+      </w:pPr>
+      <w:r>
+        <w:rPr>
+          <w:rFonts w:ascii="Consolas" w:hAnsi="Consolas"/>
+          <w:color w:val="000000"/>
+          <w:sz w:val="14"/>
+        </w:rPr>
+        <w:t xml:space="preserve"> 58  </w:t>
+      </w:r>
+    </w:p>
+    <w:p>
+      <w:pPr>
+        <w:spacing w:before="0" w:after="0" w:line="240" w:lineRule="auto"/>
+      </w:pPr>
+      <w:r>
+        <w:rPr>
+          <w:rFonts w:ascii="Consolas" w:hAnsi="Consolas"/>
+          <w:color w:val="000000"/>
+          <w:sz w:val="14"/>
+        </w:rPr>
+        <w:t xml:space="preserve"> 59  titulo("TAREA 1 - EXPLORACION DE DATOS")</w:t>
+      </w:r>
+    </w:p>
+    <w:p>
+      <w:pPr>
+        <w:spacing w:before="0" w:after="0" w:line="240" w:lineRule="auto"/>
+      </w:pPr>
+      <w:r>
+        <w:rPr>
+          <w:rFonts w:ascii="Consolas" w:hAnsi="Consolas"/>
+          <w:color w:val="000000"/>
+          <w:sz w:val="14"/>
+        </w:rPr>
+        <w:t xml:space="preserve"> 60  A = descriptivos(compras_completadas, "Dataset A - compras completadas por turno", "clientes")</w:t>
+      </w:r>
+    </w:p>
+    <w:p>
+      <w:pPr>
+        <w:spacing w:before="0" w:after="0" w:line="240" w:lineRule="auto"/>
+      </w:pPr>
+      <w:r>
+        <w:rPr>
+          <w:rFonts w:ascii="Consolas" w:hAnsi="Consolas"/>
+          <w:color w:val="000000"/>
+          <w:sz w:val="14"/>
+        </w:rPr>
+        <w:t xml:space="preserve"> 61  B = descriptivos(tiempos_entrega, "Dataset B - tiempos de entrega", "min")</w:t>
+      </w:r>
+    </w:p>
+    <w:p>
+      <w:pPr>
+        <w:spacing w:before="0" w:after="0" w:line="240" w:lineRule="auto"/>
+      </w:pPr>
+      <w:r>
+        <w:rPr>
+          <w:rFonts w:ascii="Consolas" w:hAnsi="Consolas"/>
+          <w:color w:val="000000"/>
+          <w:sz w:val="14"/>
+        </w:rPr>
+        <w:t xml:space="preserve"> 62  </w:t>
+      </w:r>
+    </w:p>
+    <w:p>
+      <w:pPr>
+        <w:spacing w:before="0" w:after="0" w:line="240" w:lineRule="auto"/>
+      </w:pPr>
+      <w:r>
+        <w:rPr>
+          <w:rFonts w:ascii="Consolas" w:hAnsi="Consolas"/>
+          <w:color w:val="000000"/>
+          <w:sz w:val="14"/>
+        </w:rPr>
+        <w:t xml:space="preserve"> 63  print("\nTabla de frecuencias del Dataset A:")</w:t>
+      </w:r>
+    </w:p>
+    <w:p>
+      <w:pPr>
+        <w:spacing w:before="0" w:after="0" w:line="240" w:lineRule="auto"/>
+      </w:pPr>
+      <w:r>
+        <w:rPr>
+          <w:rFonts w:ascii="Consolas" w:hAnsi="Consolas"/>
+          <w:color w:val="000000"/>
+          <w:sz w:val="14"/>
+        </w:rPr>
+        <w:t xml:space="preserve"> 64  frec_A = Counter(compras_completadas)</w:t>
+      </w:r>
+    </w:p>
+    <w:p>
+      <w:pPr>
+        <w:spacing w:before="0" w:after="0" w:line="240" w:lineRule="auto"/>
+      </w:pPr>
+      <w:r>
+        <w:rPr>
+          <w:rFonts w:ascii="Consolas" w:hAnsi="Consolas"/>
+          <w:color w:val="000000"/>
+          <w:sz w:val="14"/>
+        </w:rPr>
+        <w:t xml:space="preserve"> 65  for k in sorted(frec_A):</w:t>
+      </w:r>
+    </w:p>
+    <w:p>
+      <w:pPr>
+        <w:spacing w:before="0" w:after="0" w:line="240" w:lineRule="auto"/>
+      </w:pPr>
+      <w:r>
+        <w:rPr>
+          <w:rFonts w:ascii="Consolas" w:hAnsi="Consolas"/>
+          <w:color w:val="000000"/>
+          <w:sz w:val="14"/>
+        </w:rPr>
+        <w:t xml:space="preserve"> 66      print(f"  {k:2d} compras -&gt; {frec_A[k]:2d} dias ({frec_A[k] / len(compras_completadas):.3f})")</w:t>
+      </w:r>
+    </w:p>
+    <w:p>
+      <w:pPr>
+        <w:spacing w:before="0" w:after="0" w:line="240" w:lineRule="auto"/>
+      </w:pPr>
+      <w:r>
+        <w:rPr>
+          <w:rFonts w:ascii="Consolas" w:hAnsi="Consolas"/>
+          <w:color w:val="000000"/>
+          <w:sz w:val="14"/>
+        </w:rPr>
+        <w:t xml:space="preserve"> 67  </w:t>
+      </w:r>
+    </w:p>
+    <w:p>
+      <w:pPr>
+        <w:spacing w:before="0" w:after="0" w:line="240" w:lineRule="auto"/>
+      </w:pPr>
+      <w:r>
+        <w:rPr>
+          <w:rFonts w:ascii="Consolas" w:hAnsi="Consolas"/>
+          <w:color w:val="000000"/>
+          <w:sz w:val="14"/>
+        </w:rPr>
+        <w:t xml:space="preserve"> 68  print("\nDataset A: variable DISCRETA (conteo de exitos entre 12 clientes, sin valores intermedios).")</w:t>
+      </w:r>
+    </w:p>
+    <w:p>
+      <w:pPr>
+        <w:spacing w:before="0" w:after="0" w:line="240" w:lineRule="auto"/>
+      </w:pPr>
+      <w:r>
+        <w:rPr>
+          <w:rFonts w:ascii="Consolas" w:hAnsi="Consolas"/>
+          <w:color w:val="000000"/>
+          <w:sz w:val="14"/>
+        </w:rPr>
+        <w:t xml:space="preserve"> 69  print("Dataset B: variable CONTINUA (tiempo medido en una escala real, redondeado a minutos).")</w:t>
+      </w:r>
+    </w:p>
+    <w:p>
+      <w:pPr>
+        <w:spacing w:before="0" w:after="0" w:line="240" w:lineRule="auto"/>
+      </w:pPr>
+      <w:r>
+        <w:rPr>
+          <w:rFonts w:ascii="Consolas" w:hAnsi="Consolas"/>
+          <w:color w:val="000000"/>
+          <w:sz w:val="14"/>
+        </w:rPr>
+        <w:t xml:space="preserve"> 70  </w:t>
+      </w:r>
+    </w:p>
+    <w:p>
+      <w:pPr>
+        <w:spacing w:before="0" w:after="0" w:line="240" w:lineRule="auto"/>
+      </w:pPr>
+      <w:r>
+        <w:rPr>
+          <w:rFonts w:ascii="Consolas" w:hAnsi="Consolas"/>
+          <w:color w:val="000000"/>
+          <w:sz w:val="14"/>
+        </w:rPr>
+        <w:t xml:space="preserve"> 71  p_observada = A["media"] / n_clientes_por_turno</w:t>
+      </w:r>
+    </w:p>
+    <w:p>
+      <w:pPr>
+        <w:spacing w:before="0" w:after="0" w:line="240" w:lineRule="auto"/>
+      </w:pPr>
+      <w:r>
+        <w:rPr>
+          <w:rFonts w:ascii="Consolas" w:hAnsi="Consolas"/>
+          <w:color w:val="000000"/>
+          <w:sz w:val="14"/>
+        </w:rPr>
+        <w:t xml:space="preserve"> 72  print(f"\nTasa de conversion observada = {A['media']:.4f}/12 = {p_observada:.4f} "</w:t>
+      </w:r>
+    </w:p>
+    <w:p>
+      <w:pPr>
+        <w:spacing w:before="0" w:after="0" w:line="240" w:lineRule="auto"/>
+      </w:pPr>
+      <w:r>
+        <w:rPr>
+          <w:rFonts w:ascii="Consolas" w:hAnsi="Consolas"/>
+          <w:color w:val="000000"/>
+          <w:sz w:val="14"/>
+        </w:rPr>
+        <w:t xml:space="preserve"> 73        f"(historica de Gerencia: {tasa_historica_conversion})")</w:t>
+      </w:r>
+    </w:p>
+    <w:p>
+      <w:pPr>
+        <w:spacing w:before="0" w:after="0" w:line="240" w:lineRule="auto"/>
+      </w:pPr>
+      <w:r>
+        <w:rPr>
+          <w:rFonts w:ascii="Consolas" w:hAnsi="Consolas"/>
+          <w:color w:val="000000"/>
+          <w:sz w:val="14"/>
+        </w:rPr>
+        <w:t xml:space="preserve"> 74  </w:t>
+      </w:r>
+    </w:p>
+    <w:p>
+      <w:pPr>
+        <w:spacing w:before="0" w:after="0" w:line="240" w:lineRule="auto"/>
+      </w:pPr>
+      <w:r>
+        <w:rPr>
+          <w:rFonts w:ascii="Consolas" w:hAnsi="Consolas"/>
+          <w:color w:val="000000"/>
+          <w:sz w:val="14"/>
+        </w:rPr>
+        <w:t xml:space="preserve"> 75  </w:t>
+      </w:r>
+    </w:p>
+    <w:p>
+      <w:pPr>
+        <w:spacing w:before="0" w:after="0" w:line="240" w:lineRule="auto"/>
+      </w:pPr>
+      <w:r>
+        <w:rPr>
+          <w:rFonts w:ascii="Consolas" w:hAnsi="Consolas"/>
+          <w:color w:val="000000"/>
+          <w:sz w:val="14"/>
+        </w:rPr>
+        <w:t xml:space="preserve"> 76  # =====================================================================</w:t>
+      </w:r>
+    </w:p>
+    <w:p>
+      <w:pPr>
+        <w:spacing w:before="0" w:after="0" w:line="240" w:lineRule="auto"/>
+      </w:pPr>
+      <w:r>
+        <w:rPr>
+          <w:rFonts w:ascii="Consolas" w:hAnsi="Consolas"/>
+          <w:color w:val="000000"/>
+          <w:sz w:val="14"/>
+        </w:rPr>
+        <w:t xml:space="preserve"> 77  # TAREA 2 - MODELO BINOMIAL (DECISION 1: CAJERO ADICIONAL)</w:t>
+      </w:r>
+    </w:p>
+    <w:p>
+      <w:pPr>
+        <w:spacing w:before="0" w:after="0" w:line="240" w:lineRule="auto"/>
+      </w:pPr>
+      <w:r>
+        <w:rPr>
+          <w:rFonts w:ascii="Consolas" w:hAnsi="Consolas"/>
+          <w:color w:val="000000"/>
+          <w:sz w:val="14"/>
+        </w:rPr>
+        <w:t xml:space="preserve"> 78  # =====================================================================</w:t>
+      </w:r>
+    </w:p>
+    <w:p>
+      <w:pPr>
+        <w:spacing w:before="0" w:after="0" w:line="240" w:lineRule="auto"/>
+      </w:pPr>
+      <w:r>
+        <w:rPr>
+          <w:rFonts w:ascii="Consolas" w:hAnsi="Consolas"/>
+          <w:color w:val="000000"/>
+          <w:sz w:val="14"/>
+        </w:rPr>
+        <w:t xml:space="preserve"> 79  </w:t>
+      </w:r>
+    </w:p>
+    <w:p>
+      <w:pPr>
+        <w:spacing w:before="0" w:after="0" w:line="240" w:lineRule="auto"/>
+      </w:pPr>
+      <w:r>
+        <w:rPr>
+          <w:rFonts w:ascii="Consolas" w:hAnsi="Consolas"/>
+          <w:color w:val="000000"/>
+          <w:sz w:val="14"/>
+        </w:rPr>
+        <w:t xml:space="preserve"> 80  def binom_pmf(k, n, p):</w:t>
+      </w:r>
+    </w:p>
+    <w:p>
+      <w:pPr>
+        <w:spacing w:before="0" w:after="0" w:line="240" w:lineRule="auto"/>
+      </w:pPr>
+      <w:r>
+        <w:rPr>
+          <w:rFonts w:ascii="Consolas" w:hAnsi="Consolas"/>
+          <w:color w:val="000000"/>
+          <w:sz w:val="14"/>
+        </w:rPr>
+        <w:t xml:space="preserve"> 81      """P(X = k) para X ~ Binomial(n, p). C(n,k) * p^k * (1-p)^(n-k)."""</w:t>
+      </w:r>
+    </w:p>
+    <w:p>
+      <w:pPr>
+        <w:spacing w:before="0" w:after="0" w:line="240" w:lineRule="auto"/>
+      </w:pPr>
+      <w:r>
+        <w:rPr>
+          <w:rFonts w:ascii="Consolas" w:hAnsi="Consolas"/>
+          <w:color w:val="000000"/>
+          <w:sz w:val="14"/>
+        </w:rPr>
+        <w:t xml:space="preserve"> 82      return math.comb(n, k) * (p ** k) * ((1 - p) ** (n - k))</w:t>
+      </w:r>
+    </w:p>
+    <w:p>
+      <w:pPr>
+        <w:spacing w:before="0" w:after="0" w:line="240" w:lineRule="auto"/>
+      </w:pPr>
+      <w:r>
+        <w:rPr>
+          <w:rFonts w:ascii="Consolas" w:hAnsi="Consolas"/>
+          <w:color w:val="000000"/>
+          <w:sz w:val="14"/>
+        </w:rPr>
+        <w:t xml:space="preserve"> 83  </w:t>
+      </w:r>
+    </w:p>
+    <w:p>
+      <w:pPr>
+        <w:spacing w:before="0" w:after="0" w:line="240" w:lineRule="auto"/>
+      </w:pPr>
+      <w:r>
+        <w:rPr>
+          <w:rFonts w:ascii="Consolas" w:hAnsi="Consolas"/>
+          <w:color w:val="000000"/>
+          <w:sz w:val="14"/>
+        </w:rPr>
+        <w:t xml:space="preserve"> 84  </w:t>
+      </w:r>
+    </w:p>
+    <w:p>
+      <w:pPr>
+        <w:spacing w:before="0" w:after="0" w:line="240" w:lineRule="auto"/>
+      </w:pPr>
+      <w:r>
+        <w:rPr>
+          <w:rFonts w:ascii="Consolas" w:hAnsi="Consolas"/>
+          <w:color w:val="000000"/>
+          <w:sz w:val="14"/>
+        </w:rPr>
+        <w:t xml:space="preserve"> 85  titulo("TAREA 2 - MODELO BINOMIAL  X ~ Bin(n=12, p=0.65)")</w:t>
+      </w:r>
+    </w:p>
+    <w:p>
+      <w:pPr>
+        <w:spacing w:before="0" w:after="0" w:line="240" w:lineRule="auto"/>
+      </w:pPr>
+      <w:r>
+        <w:rPr>
+          <w:rFonts w:ascii="Consolas" w:hAnsi="Consolas"/>
+          <w:color w:val="000000"/>
+          <w:sz w:val="14"/>
+        </w:rPr>
+        <w:t xml:space="preserve"> 86  </w:t>
+      </w:r>
+    </w:p>
+    <w:p>
+      <w:pPr>
+        <w:spacing w:before="0" w:after="0" w:line="240" w:lineRule="auto"/>
+      </w:pPr>
+      <w:r>
+        <w:rPr>
+          <w:rFonts w:ascii="Consolas" w:hAnsi="Consolas"/>
+          <w:color w:val="000000"/>
+          <w:sz w:val="14"/>
+        </w:rPr>
+        <w:t xml:space="preserve"> 87  n, p = n_clientes_por_turno, tasa_historica_conversion</w:t>
+      </w:r>
+    </w:p>
+    <w:p>
+      <w:pPr>
+        <w:spacing w:before="0" w:after="0" w:line="240" w:lineRule="auto"/>
+      </w:pPr>
+      <w:r>
+        <w:rPr>
+          <w:rFonts w:ascii="Consolas" w:hAnsi="Consolas"/>
+          <w:color w:val="000000"/>
+          <w:sz w:val="14"/>
+        </w:rPr>
+        <w:t xml:space="preserve"> 88  print("\n  k     P(X = k)")</w:t>
+      </w:r>
+    </w:p>
+    <w:p>
+      <w:pPr>
+        <w:spacing w:before="0" w:after="0" w:line="240" w:lineRule="auto"/>
+      </w:pPr>
+      <w:r>
+        <w:rPr>
+          <w:rFonts w:ascii="Consolas" w:hAnsi="Consolas"/>
+          <w:color w:val="000000"/>
+          <w:sz w:val="14"/>
+        </w:rPr>
+        <w:t xml:space="preserve"> 89  for k in range(n + 1):</w:t>
+      </w:r>
+    </w:p>
+    <w:p>
+      <w:pPr>
+        <w:spacing w:before="0" w:after="0" w:line="240" w:lineRule="auto"/>
+      </w:pPr>
+      <w:r>
+        <w:rPr>
+          <w:rFonts w:ascii="Consolas" w:hAnsi="Consolas"/>
+          <w:color w:val="000000"/>
+          <w:sz w:val="14"/>
+        </w:rPr>
+        <w:t xml:space="preserve"> 90      marca = "  &lt;-- cuenta para P(X &gt; 8)" if k &gt; 8 else ""</w:t>
+      </w:r>
+    </w:p>
+    <w:p>
+      <w:pPr>
+        <w:spacing w:before="0" w:after="0" w:line="240" w:lineRule="auto"/>
+      </w:pPr>
+      <w:r>
+        <w:rPr>
+          <w:rFonts w:ascii="Consolas" w:hAnsi="Consolas"/>
+          <w:color w:val="000000"/>
+          <w:sz w:val="14"/>
+        </w:rPr>
+        <w:t xml:space="preserve"> 91      print(f"  {k:2d}    {binom_pmf(k, n, p):.6f}{marca}")</w:t>
+      </w:r>
+    </w:p>
+    <w:p>
+      <w:pPr>
+        <w:spacing w:before="0" w:after="0" w:line="240" w:lineRule="auto"/>
+      </w:pPr>
+      <w:r>
+        <w:rPr>
+          <w:rFonts w:ascii="Consolas" w:hAnsi="Consolas"/>
+          <w:color w:val="000000"/>
+          <w:sz w:val="14"/>
+        </w:rPr>
+        <w:t xml:space="preserve"> 92  </w:t>
+      </w:r>
+    </w:p>
+    <w:p>
+      <w:pPr>
+        <w:spacing w:before="0" w:after="0" w:line="240" w:lineRule="auto"/>
+      </w:pPr>
+      <w:r>
+        <w:rPr>
+          <w:rFonts w:ascii="Consolas" w:hAnsi="Consolas"/>
+          <w:color w:val="000000"/>
+          <w:sz w:val="14"/>
+        </w:rPr>
+        <w:t xml:space="preserve"> 93  p_teorica = sum(binom_pmf(k, n, p) for k in range(9, n + 1))</w:t>
+      </w:r>
+    </w:p>
+    <w:p>
+      <w:pPr>
+        <w:spacing w:before="0" w:after="0" w:line="240" w:lineRule="auto"/>
+      </w:pPr>
+      <w:r>
+        <w:rPr>
+          <w:rFonts w:ascii="Consolas" w:hAnsi="Consolas"/>
+          <w:color w:val="000000"/>
+          <w:sz w:val="14"/>
+        </w:rPr>
+        <w:t xml:space="preserve"> 94  dias_criticos = sum(1 for x in compras_completadas if x &gt; 8)</w:t>
+      </w:r>
+    </w:p>
+    <w:p>
+      <w:pPr>
+        <w:spacing w:before="0" w:after="0" w:line="240" w:lineRule="auto"/>
+      </w:pPr>
+      <w:r>
+        <w:rPr>
+          <w:rFonts w:ascii="Consolas" w:hAnsi="Consolas"/>
+          <w:color w:val="000000"/>
+          <w:sz w:val="14"/>
+        </w:rPr>
+        <w:t xml:space="preserve"> 95  p_empirica = dias_criticos / len(compras_completadas)</w:t>
+      </w:r>
+    </w:p>
+    <w:p>
+      <w:pPr>
+        <w:spacing w:before="0" w:after="0" w:line="240" w:lineRule="auto"/>
+      </w:pPr>
+      <w:r>
+        <w:rPr>
+          <w:rFonts w:ascii="Consolas" w:hAnsi="Consolas"/>
+          <w:color w:val="000000"/>
+          <w:sz w:val="14"/>
+        </w:rPr>
+        <w:t xml:space="preserve"> 96  </w:t>
+      </w:r>
+    </w:p>
+    <w:p>
+      <w:pPr>
+        <w:spacing w:before="0" w:after="0" w:line="240" w:lineRule="auto"/>
+      </w:pPr>
+      <w:r>
+        <w:rPr>
+          <w:rFonts w:ascii="Consolas" w:hAnsi="Consolas"/>
+          <w:color w:val="000000"/>
+          <w:sz w:val="14"/>
+        </w:rPr>
+        <w:t xml:space="preserve"> 97  print(f"\nP(X &gt; 8) teorica  = {p_teorica:.6f}  -&gt;  {p_teorica * 100:.2f}%")</w:t>
+      </w:r>
+    </w:p>
+    <w:p>
+      <w:pPr>
+        <w:spacing w:before="0" w:after="0" w:line="240" w:lineRule="auto"/>
+      </w:pPr>
+      <w:r>
+        <w:rPr>
+          <w:rFonts w:ascii="Consolas" w:hAnsi="Consolas"/>
+          <w:color w:val="000000"/>
+          <w:sz w:val="14"/>
+        </w:rPr>
+        <w:t xml:space="preserve"> 98  print(f"Proporcion empirica = {dias_criticos}/{len(compras_completadas)} = "</w:t>
+      </w:r>
+    </w:p>
+    <w:p>
+      <w:pPr>
+        <w:spacing w:before="0" w:after="0" w:line="240" w:lineRule="auto"/>
+      </w:pPr>
+      <w:r>
+        <w:rPr>
+          <w:rFonts w:ascii="Consolas" w:hAnsi="Consolas"/>
+          <w:color w:val="000000"/>
+          <w:sz w:val="14"/>
+        </w:rPr>
+        <w:t xml:space="preserve"> 99        f"{p_empirica:.6f}  -&gt;  {p_empirica * 100:.2f}%")</w:t>
+      </w:r>
+    </w:p>
+    <w:p>
+      <w:pPr>
+        <w:spacing w:before="0" w:after="0" w:line="240" w:lineRule="auto"/>
+      </w:pPr>
+      <w:r>
+        <w:rPr>
+          <w:rFonts w:ascii="Consolas" w:hAnsi="Consolas"/>
+          <w:color w:val="000000"/>
+          <w:sz w:val="14"/>
+        </w:rPr>
+        <w:t>100  print(f"Diferencia = {(p_empirica - p_teorica) * 100:.2f} puntos porcentuales")</w:t>
+      </w:r>
+    </w:p>
+    <w:p>
+      <w:pPr>
+        <w:spacing w:before="0" w:after="0" w:line="240" w:lineRule="auto"/>
+      </w:pPr>
+      <w:r>
+        <w:rPr>
+          <w:rFonts w:ascii="Consolas" w:hAnsi="Consolas"/>
+          <w:color w:val="000000"/>
+          <w:sz w:val="14"/>
+        </w:rPr>
+        <w:t xml:space="preserve">101  </w:t>
+      </w:r>
+    </w:p>
+    <w:p>
+      <w:pPr>
+        <w:spacing w:before="0" w:after="0" w:line="240" w:lineRule="auto"/>
+      </w:pPr>
+      <w:r>
+        <w:rPr>
+          <w:rFonts w:ascii="Consolas" w:hAnsi="Consolas"/>
+          <w:color w:val="000000"/>
+          <w:sz w:val="14"/>
+        </w:rPr>
+        <w:t>102  print(f"\nMedia teorica  n*p     = {n * p:.4f}   vs media observada    = {A['media']:.4f}")</w:t>
+      </w:r>
+    </w:p>
+    <w:p>
+      <w:pPr>
+        <w:spacing w:before="0" w:after="0" w:line="240" w:lineRule="auto"/>
+      </w:pPr>
+      <w:r>
+        <w:rPr>
+          <w:rFonts w:ascii="Consolas" w:hAnsi="Consolas"/>
+          <w:color w:val="000000"/>
+          <w:sz w:val="14"/>
+        </w:rPr>
+        <w:t>103  print(f"Varianza teorica n*p*q = {n * p * (1 - p):.4f}   vs varianza observada = {A['var_pob']:.4f}")</w:t>
+      </w:r>
+    </w:p>
+    <w:p>
+      <w:pPr>
+        <w:spacing w:before="0" w:after="0" w:line="240" w:lineRule="auto"/>
+      </w:pPr>
+      <w:r>
+        <w:rPr>
+          <w:rFonts w:ascii="Consolas" w:hAnsi="Consolas"/>
+          <w:color w:val="000000"/>
+          <w:sz w:val="14"/>
+        </w:rPr>
+        <w:t xml:space="preserve">104  </w:t>
+      </w:r>
+    </w:p>
+    <w:p>
+      <w:pPr>
+        <w:spacing w:before="0" w:after="0" w:line="240" w:lineRule="auto"/>
+      </w:pPr>
+      <w:r>
+        <w:rPr>
+          <w:rFonts w:ascii="Consolas" w:hAnsi="Consolas"/>
+          <w:color w:val="000000"/>
+          <w:sz w:val="14"/>
+        </w:rPr>
+        <w:t>105  # Intervalo de confianza del 95% para la proporcion empirica (aproximacion normal)</w:t>
+      </w:r>
+    </w:p>
+    <w:p>
+      <w:pPr>
+        <w:spacing w:before="0" w:after="0" w:line="240" w:lineRule="auto"/>
+      </w:pPr>
+      <w:r>
+        <w:rPr>
+          <w:rFonts w:ascii="Consolas" w:hAnsi="Consolas"/>
+          <w:color w:val="000000"/>
+          <w:sz w:val="14"/>
+        </w:rPr>
+        <w:t>106  ee = math.sqrt(p_empirica * (1 - p_empirica) / len(compras_completadas))</w:t>
+      </w:r>
+    </w:p>
+    <w:p>
+      <w:pPr>
+        <w:spacing w:before="0" w:after="0" w:line="240" w:lineRule="auto"/>
+      </w:pPr>
+      <w:r>
+        <w:rPr>
+          <w:rFonts w:ascii="Consolas" w:hAnsi="Consolas"/>
+          <w:color w:val="000000"/>
+          <w:sz w:val="14"/>
+        </w:rPr>
+        <w:t>107  ic_bajo, ic_alto = p_empirica - 1.96 * ee, p_empirica + 1.96 * ee</w:t>
+      </w:r>
+    </w:p>
+    <w:p>
+      <w:pPr>
+        <w:spacing w:before="0" w:after="0" w:line="240" w:lineRule="auto"/>
+      </w:pPr>
+      <w:r>
+        <w:rPr>
+          <w:rFonts w:ascii="Consolas" w:hAnsi="Consolas"/>
+          <w:color w:val="000000"/>
+          <w:sz w:val="14"/>
+        </w:rPr>
+        <w:t>108  print(f"IC 95% de la proporcion empirica: [{ic_bajo:.4f}, {ic_alto:.4f}] "</w:t>
+      </w:r>
+    </w:p>
+    <w:p>
+      <w:pPr>
+        <w:spacing w:before="0" w:after="0" w:line="240" w:lineRule="auto"/>
+      </w:pPr>
+      <w:r>
+        <w:rPr>
+          <w:rFonts w:ascii="Consolas" w:hAnsi="Consolas"/>
+          <w:color w:val="000000"/>
+          <w:sz w:val="14"/>
+        </w:rPr>
+        <w:t>109        f"-&gt; contiene a {p_teorica:.4f}, la diferencia no es estadisticamente significativa.")</w:t>
+      </w:r>
+    </w:p>
+    <w:p>
+      <w:pPr>
+        <w:spacing w:before="0" w:after="0" w:line="240" w:lineRule="auto"/>
+      </w:pPr>
+      <w:r>
+        <w:rPr>
+          <w:rFonts w:ascii="Consolas" w:hAnsi="Consolas"/>
+          <w:color w:val="000000"/>
+          <w:sz w:val="14"/>
+        </w:rPr>
+        <w:t xml:space="preserve">110  </w:t>
+      </w:r>
+    </w:p>
+    <w:p>
+      <w:pPr>
+        <w:spacing w:before="0" w:after="0" w:line="240" w:lineRule="auto"/>
+      </w:pPr>
+      <w:r>
+        <w:rPr>
+          <w:rFonts w:ascii="Consolas" w:hAnsi="Consolas"/>
+          <w:color w:val="000000"/>
+          <w:sz w:val="14"/>
+        </w:rPr>
+        <w:t xml:space="preserve">111  </w:t>
+      </w:r>
+    </w:p>
+    <w:p>
+      <w:pPr>
+        <w:spacing w:before="0" w:after="0" w:line="240" w:lineRule="auto"/>
+      </w:pPr>
+      <w:r>
+        <w:rPr>
+          <w:rFonts w:ascii="Consolas" w:hAnsi="Consolas"/>
+          <w:color w:val="000000"/>
+          <w:sz w:val="14"/>
+        </w:rPr>
+        <w:t>112  # =====================================================================</w:t>
+      </w:r>
+    </w:p>
+    <w:p>
+      <w:pPr>
+        <w:spacing w:before="0" w:after="0" w:line="240" w:lineRule="auto"/>
+      </w:pPr>
+      <w:r>
+        <w:rPr>
+          <w:rFonts w:ascii="Consolas" w:hAnsi="Consolas"/>
+          <w:color w:val="000000"/>
+          <w:sz w:val="14"/>
+        </w:rPr>
+        <w:t>113  # TAREA 3 - VERIFICACION POR SIMULACION MONTE CARLO</w:t>
+      </w:r>
+    </w:p>
+    <w:p>
+      <w:pPr>
+        <w:spacing w:before="0" w:after="0" w:line="240" w:lineRule="auto"/>
+      </w:pPr>
+      <w:r>
+        <w:rPr>
+          <w:rFonts w:ascii="Consolas" w:hAnsi="Consolas"/>
+          <w:color w:val="000000"/>
+          <w:sz w:val="14"/>
+        </w:rPr>
+        <w:t>114  # =====================================================================</w:t>
+      </w:r>
+    </w:p>
+    <w:p>
+      <w:pPr>
+        <w:spacing w:before="0" w:after="0" w:line="240" w:lineRule="auto"/>
+      </w:pPr>
+      <w:r>
+        <w:rPr>
+          <w:rFonts w:ascii="Consolas" w:hAnsi="Consolas"/>
+          <w:color w:val="000000"/>
+          <w:sz w:val="14"/>
+        </w:rPr>
+        <w:t xml:space="preserve">115  </w:t>
+      </w:r>
+    </w:p>
+    <w:p>
+      <w:pPr>
+        <w:spacing w:before="0" w:after="0" w:line="240" w:lineRule="auto"/>
+      </w:pPr>
+      <w:r>
+        <w:rPr>
+          <w:rFonts w:ascii="Consolas" w:hAnsi="Consolas"/>
+          <w:color w:val="000000"/>
+          <w:sz w:val="14"/>
+        </w:rPr>
+        <w:t>116  def simular_turnos(n_turnos, n=12, p=0.65, semilla=SEMILLA):</w:t>
+      </w:r>
+    </w:p>
+    <w:p>
+      <w:pPr>
+        <w:spacing w:before="0" w:after="0" w:line="240" w:lineRule="auto"/>
+      </w:pPr>
+      <w:r>
+        <w:rPr>
+          <w:rFonts w:ascii="Consolas" w:hAnsi="Consolas"/>
+          <w:color w:val="000000"/>
+          <w:sz w:val="14"/>
+        </w:rPr>
+        <w:t>117      """Simula n_turnos turnos. Cada turno son 12 ensayos Bernoulli independientes."""</w:t>
+      </w:r>
+    </w:p>
+    <w:p>
+      <w:pPr>
+        <w:spacing w:before="0" w:after="0" w:line="240" w:lineRule="auto"/>
+      </w:pPr>
+      <w:r>
+        <w:rPr>
+          <w:rFonts w:ascii="Consolas" w:hAnsi="Consolas"/>
+          <w:color w:val="000000"/>
+          <w:sz w:val="14"/>
+        </w:rPr>
+        <w:t>118      random.seed(semilla)</w:t>
+      </w:r>
+    </w:p>
+    <w:p>
+      <w:pPr>
+        <w:spacing w:before="0" w:after="0" w:line="240" w:lineRule="auto"/>
+      </w:pPr>
+      <w:r>
+        <w:rPr>
+          <w:rFonts w:ascii="Consolas" w:hAnsi="Consolas"/>
+          <w:color w:val="000000"/>
+          <w:sz w:val="14"/>
+        </w:rPr>
+        <w:t>119      turnos = [sum(1 for _ in range(n) if random.random() &lt; p) for _ in range(n_turnos)]</w:t>
+      </w:r>
+    </w:p>
+    <w:p>
+      <w:pPr>
+        <w:spacing w:before="0" w:after="0" w:line="240" w:lineRule="auto"/>
+      </w:pPr>
+      <w:r>
+        <w:rPr>
+          <w:rFonts w:ascii="Consolas" w:hAnsi="Consolas"/>
+          <w:color w:val="000000"/>
+          <w:sz w:val="14"/>
+        </w:rPr>
+        <w:t>120      return turnos</w:t>
+      </w:r>
+    </w:p>
+    <w:p>
+      <w:pPr>
+        <w:spacing w:before="0" w:after="0" w:line="240" w:lineRule="auto"/>
+      </w:pPr>
+      <w:r>
+        <w:rPr>
+          <w:rFonts w:ascii="Consolas" w:hAnsi="Consolas"/>
+          <w:color w:val="000000"/>
+          <w:sz w:val="14"/>
+        </w:rPr>
+        <w:t xml:space="preserve">121  </w:t>
+      </w:r>
+    </w:p>
+    <w:p>
+      <w:pPr>
+        <w:spacing w:before="0" w:after="0" w:line="240" w:lineRule="auto"/>
+      </w:pPr>
+      <w:r>
+        <w:rPr>
+          <w:rFonts w:ascii="Consolas" w:hAnsi="Consolas"/>
+          <w:color w:val="000000"/>
+          <w:sz w:val="14"/>
+        </w:rPr>
+        <w:t xml:space="preserve">122  </w:t>
+      </w:r>
+    </w:p>
+    <w:p>
+      <w:pPr>
+        <w:spacing w:before="0" w:after="0" w:line="240" w:lineRule="auto"/>
+      </w:pPr>
+      <w:r>
+        <w:rPr>
+          <w:rFonts w:ascii="Consolas" w:hAnsi="Consolas"/>
+          <w:color w:val="000000"/>
+          <w:sz w:val="14"/>
+        </w:rPr>
+        <w:t>123  titulo("TAREA 3 - SIMULACION MONTE CARLO")</w:t>
+      </w:r>
+    </w:p>
+    <w:p>
+      <w:pPr>
+        <w:spacing w:before="0" w:after="0" w:line="240" w:lineRule="auto"/>
+      </w:pPr>
+      <w:r>
+        <w:rPr>
+          <w:rFonts w:ascii="Consolas" w:hAnsi="Consolas"/>
+          <w:color w:val="000000"/>
+          <w:sz w:val="14"/>
+        </w:rPr>
+        <w:t xml:space="preserve">124  </w:t>
+      </w:r>
+    </w:p>
+    <w:p>
+      <w:pPr>
+        <w:spacing w:before="0" w:after="0" w:line="240" w:lineRule="auto"/>
+      </w:pPr>
+      <w:r>
+        <w:rPr>
+          <w:rFonts w:ascii="Consolas" w:hAnsi="Consolas"/>
+          <w:color w:val="000000"/>
+          <w:sz w:val="14"/>
+        </w:rPr>
+        <w:t>125  print("\n  turnos      P(X &gt; 8) simulada    error vs teorica")</w:t>
+      </w:r>
+    </w:p>
+    <w:p>
+      <w:pPr>
+        <w:spacing w:before="0" w:after="0" w:line="240" w:lineRule="auto"/>
+      </w:pPr>
+      <w:r>
+        <w:rPr>
+          <w:rFonts w:ascii="Consolas" w:hAnsi="Consolas"/>
+          <w:color w:val="000000"/>
+          <w:sz w:val="14"/>
+        </w:rPr>
+        <w:t>126  resultados_sim = {}</w:t>
+      </w:r>
+    </w:p>
+    <w:p>
+      <w:pPr>
+        <w:spacing w:before="0" w:after="0" w:line="240" w:lineRule="auto"/>
+      </w:pPr>
+      <w:r>
+        <w:rPr>
+          <w:rFonts w:ascii="Consolas" w:hAnsi="Consolas"/>
+          <w:color w:val="000000"/>
+          <w:sz w:val="14"/>
+        </w:rPr>
+        <w:t>127  for n_turnos in (1_000, 10_000, 100_000):</w:t>
+      </w:r>
+    </w:p>
+    <w:p>
+      <w:pPr>
+        <w:spacing w:before="0" w:after="0" w:line="240" w:lineRule="auto"/>
+      </w:pPr>
+      <w:r>
+        <w:rPr>
+          <w:rFonts w:ascii="Consolas" w:hAnsi="Consolas"/>
+          <w:color w:val="000000"/>
+          <w:sz w:val="14"/>
+        </w:rPr>
+        <w:t>128      turnos = simular_turnos(n_turnos)</w:t>
+      </w:r>
+    </w:p>
+    <w:p>
+      <w:pPr>
+        <w:spacing w:before="0" w:after="0" w:line="240" w:lineRule="auto"/>
+      </w:pPr>
+      <w:r>
+        <w:rPr>
+          <w:rFonts w:ascii="Consolas" w:hAnsi="Consolas"/>
+          <w:color w:val="000000"/>
+          <w:sz w:val="14"/>
+        </w:rPr>
+        <w:t>129      p_sim = sum(1 for x in turnos if x &gt; 8) / n_turnos</w:t>
+      </w:r>
+    </w:p>
+    <w:p>
+      <w:pPr>
+        <w:spacing w:before="0" w:after="0" w:line="240" w:lineRule="auto"/>
+      </w:pPr>
+      <w:r>
+        <w:rPr>
+          <w:rFonts w:ascii="Consolas" w:hAnsi="Consolas"/>
+          <w:color w:val="000000"/>
+          <w:sz w:val="14"/>
+        </w:rPr>
+        <w:t>130      resultados_sim[n_turnos] = p_sim</w:t>
+      </w:r>
+    </w:p>
+    <w:p>
+      <w:pPr>
+        <w:spacing w:before="0" w:after="0" w:line="240" w:lineRule="auto"/>
+      </w:pPr>
+      <w:r>
+        <w:rPr>
+          <w:rFonts w:ascii="Consolas" w:hAnsi="Consolas"/>
+          <w:color w:val="000000"/>
+          <w:sz w:val="14"/>
+        </w:rPr>
+        <w:t>131      print(f"  {n_turnos:&gt;7,}     {p_sim:.4f}               {abs(p_sim - p_teorica):.4f}")</w:t>
+      </w:r>
+    </w:p>
+    <w:p>
+      <w:pPr>
+        <w:spacing w:before="0" w:after="0" w:line="240" w:lineRule="auto"/>
+      </w:pPr>
+      <w:r>
+        <w:rPr>
+          <w:rFonts w:ascii="Consolas" w:hAnsi="Consolas"/>
+          <w:color w:val="000000"/>
+          <w:sz w:val="14"/>
+        </w:rPr>
+        <w:t xml:space="preserve">132  </w:t>
+      </w:r>
+    </w:p>
+    <w:p>
+      <w:pPr>
+        <w:spacing w:before="0" w:after="0" w:line="240" w:lineRule="auto"/>
+      </w:pPr>
+      <w:r>
+        <w:rPr>
+          <w:rFonts w:ascii="Consolas" w:hAnsi="Consolas"/>
+          <w:color w:val="000000"/>
+          <w:sz w:val="14"/>
+        </w:rPr>
+        <w:t>133  turnos_10k = simular_turnos(10_000)</w:t>
+      </w:r>
+    </w:p>
+    <w:p>
+      <w:pPr>
+        <w:spacing w:before="0" w:after="0" w:line="240" w:lineRule="auto"/>
+      </w:pPr>
+      <w:r>
+        <w:rPr>
+          <w:rFonts w:ascii="Consolas" w:hAnsi="Consolas"/>
+          <w:color w:val="000000"/>
+          <w:sz w:val="14"/>
+        </w:rPr>
+        <w:t>134  print(f"\nMedia de la simulacion (10,000 turnos) = {st.mean(turnos_10k):.4f} (teorica {n * p:.2f})")</w:t>
+      </w:r>
+    </w:p>
+    <w:p>
+      <w:pPr>
+        <w:spacing w:before="0" w:after="0" w:line="240" w:lineRule="auto"/>
+      </w:pPr>
+      <w:r>
+        <w:rPr>
+          <w:rFonts w:ascii="Consolas" w:hAnsi="Consolas"/>
+          <w:color w:val="000000"/>
+          <w:sz w:val="14"/>
+        </w:rPr>
+        <w:t>135  print("La frecuencia simulada converge al valor teorico conforme crece el numero de turnos.")</w:t>
+      </w:r>
+    </w:p>
+    <w:p>
+      <w:pPr>
+        <w:spacing w:before="0" w:after="0" w:line="240" w:lineRule="auto"/>
+      </w:pPr>
+      <w:r>
+        <w:rPr>
+          <w:rFonts w:ascii="Consolas" w:hAnsi="Consolas"/>
+          <w:color w:val="000000"/>
+          <w:sz w:val="14"/>
+        </w:rPr>
+        <w:t xml:space="preserve">136  </w:t>
+      </w:r>
+    </w:p>
+    <w:p>
+      <w:pPr>
+        <w:spacing w:before="0" w:after="0" w:line="240" w:lineRule="auto"/>
+      </w:pPr>
+      <w:r>
+        <w:rPr>
+          <w:rFonts w:ascii="Consolas" w:hAnsi="Consolas"/>
+          <w:color w:val="000000"/>
+          <w:sz w:val="14"/>
+        </w:rPr>
+        <w:t xml:space="preserve">137  </w:t>
+      </w:r>
+    </w:p>
+    <w:p>
+      <w:pPr>
+        <w:spacing w:before="0" w:after="0" w:line="240" w:lineRule="auto"/>
+      </w:pPr>
+      <w:r>
+        <w:rPr>
+          <w:rFonts w:ascii="Consolas" w:hAnsi="Consolas"/>
+          <w:color w:val="000000"/>
+          <w:sz w:val="14"/>
+        </w:rPr>
+        <w:t>138  # =====================================================================</w:t>
+      </w:r>
+    </w:p>
+    <w:p>
+      <w:pPr>
+        <w:spacing w:before="0" w:after="0" w:line="240" w:lineRule="auto"/>
+      </w:pPr>
+      <w:r>
+        <w:rPr>
+          <w:rFonts w:ascii="Consolas" w:hAnsi="Consolas"/>
+          <w:color w:val="000000"/>
+          <w:sz w:val="14"/>
+        </w:rPr>
+        <w:t>139  # TAREA 4 - MODELO NORMAL Y ATIPICOS (DECISION 2: GARANTIA DE ENTREGA)</w:t>
+      </w:r>
+    </w:p>
+    <w:p>
+      <w:pPr>
+        <w:spacing w:before="0" w:after="0" w:line="240" w:lineRule="auto"/>
+      </w:pPr>
+      <w:r>
+        <w:rPr>
+          <w:rFonts w:ascii="Consolas" w:hAnsi="Consolas"/>
+          <w:color w:val="000000"/>
+          <w:sz w:val="14"/>
+        </w:rPr>
+        <w:t>140  # =====================================================================</w:t>
+      </w:r>
+    </w:p>
+    <w:p>
+      <w:pPr>
+        <w:spacing w:before="0" w:after="0" w:line="240" w:lineRule="auto"/>
+      </w:pPr>
+      <w:r>
+        <w:rPr>
+          <w:rFonts w:ascii="Consolas" w:hAnsi="Consolas"/>
+          <w:color w:val="000000"/>
+          <w:sz w:val="14"/>
+        </w:rPr>
+        <w:t xml:space="preserve">141  </w:t>
+      </w:r>
+    </w:p>
+    <w:p>
+      <w:pPr>
+        <w:spacing w:before="0" w:after="0" w:line="240" w:lineRule="auto"/>
+      </w:pPr>
+      <w:r>
+        <w:rPr>
+          <w:rFonts w:ascii="Consolas" w:hAnsi="Consolas"/>
+          <w:color w:val="000000"/>
+          <w:sz w:val="14"/>
+        </w:rPr>
+        <w:t>142  titulo("TAREA 4 - MODELO NORMAL Y VALORES ATIPICOS")</w:t>
+      </w:r>
+    </w:p>
+    <w:p>
+      <w:pPr>
+        <w:spacing w:before="0" w:after="0" w:line="240" w:lineRule="auto"/>
+      </w:pPr>
+      <w:r>
+        <w:rPr>
+          <w:rFonts w:ascii="Consolas" w:hAnsi="Consolas"/>
+          <w:color w:val="000000"/>
+          <w:sz w:val="14"/>
+        </w:rPr>
+        <w:t xml:space="preserve">143  </w:t>
+      </w:r>
+    </w:p>
+    <w:p>
+      <w:pPr>
+        <w:spacing w:before="0" w:after="0" w:line="240" w:lineRule="auto"/>
+      </w:pPr>
+      <w:r>
+        <w:rPr>
+          <w:rFonts w:ascii="Consolas" w:hAnsi="Consolas"/>
+          <w:color w:val="000000"/>
+          <w:sz w:val="14"/>
+        </w:rPr>
+        <w:t xml:space="preserve">144  </w:t>
+      </w:r>
+    </w:p>
+    <w:p>
+      <w:pPr>
+        <w:spacing w:before="0" w:after="0" w:line="240" w:lineRule="auto"/>
+      </w:pPr>
+      <w:r>
+        <w:rPr>
+          <w:rFonts w:ascii="Consolas" w:hAnsi="Consolas"/>
+          <w:color w:val="000000"/>
+          <w:sz w:val="14"/>
+        </w:rPr>
+        <w:t>145  def regla_empirica(datos, etiqueta):</w:t>
+      </w:r>
+    </w:p>
+    <w:p>
+      <w:pPr>
+        <w:spacing w:before="0" w:after="0" w:line="240" w:lineRule="auto"/>
+      </w:pPr>
+      <w:r>
+        <w:rPr>
+          <w:rFonts w:ascii="Consolas" w:hAnsi="Consolas"/>
+          <w:color w:val="000000"/>
+          <w:sz w:val="14"/>
+        </w:rPr>
+        <w:t>146      media, sd = st.mean(datos), st.pstdev(datos)</w:t>
+      </w:r>
+    </w:p>
+    <w:p>
+      <w:pPr>
+        <w:spacing w:before="0" w:after="0" w:line="240" w:lineRule="auto"/>
+      </w:pPr>
+      <w:r>
+        <w:rPr>
+          <w:rFonts w:ascii="Consolas" w:hAnsi="Consolas"/>
+          <w:color w:val="000000"/>
+          <w:sz w:val="14"/>
+        </w:rPr>
+        <w:t>147      print(f"\nRegla empirica - {etiqueta} (media {media:.4f}, sigma {sd:.4f})")</w:t>
+      </w:r>
+    </w:p>
+    <w:p>
+      <w:pPr>
+        <w:spacing w:before="0" w:after="0" w:line="240" w:lineRule="auto"/>
+      </w:pPr>
+      <w:r>
+        <w:rPr>
+          <w:rFonts w:ascii="Consolas" w:hAnsi="Consolas"/>
+          <w:color w:val="000000"/>
+          <w:sz w:val="14"/>
+        </w:rPr>
+        <w:t>148      esperado = {1: 68, 2: 95, 3: 99.7}</w:t>
+      </w:r>
+    </w:p>
+    <w:p>
+      <w:pPr>
+        <w:spacing w:before="0" w:after="0" w:line="240" w:lineRule="auto"/>
+      </w:pPr>
+      <w:r>
+        <w:rPr>
+          <w:rFonts w:ascii="Consolas" w:hAnsi="Consolas"/>
+          <w:color w:val="000000"/>
+          <w:sz w:val="14"/>
+        </w:rPr>
+        <w:t>149      for k in (1, 2, 3):</w:t>
+      </w:r>
+    </w:p>
+    <w:p>
+      <w:pPr>
+        <w:spacing w:before="0" w:after="0" w:line="240" w:lineRule="auto"/>
+      </w:pPr>
+      <w:r>
+        <w:rPr>
+          <w:rFonts w:ascii="Consolas" w:hAnsi="Consolas"/>
+          <w:color w:val="000000"/>
+          <w:sz w:val="14"/>
+        </w:rPr>
+        <w:t>150          lo, hi = media - k * sd, media + k * sd</w:t>
+      </w:r>
+    </w:p>
+    <w:p>
+      <w:pPr>
+        <w:spacing w:before="0" w:after="0" w:line="240" w:lineRule="auto"/>
+      </w:pPr>
+      <w:r>
+        <w:rPr>
+          <w:rFonts w:ascii="Consolas" w:hAnsi="Consolas"/>
+          <w:color w:val="000000"/>
+          <w:sz w:val="14"/>
+        </w:rPr>
+        <w:t>151          dentro = sum(1 for x in datos if lo &lt;= x &lt;= hi)</w:t>
+      </w:r>
+    </w:p>
+    <w:p>
+      <w:pPr>
+        <w:spacing w:before="0" w:after="0" w:line="240" w:lineRule="auto"/>
+      </w:pPr>
+      <w:r>
+        <w:rPr>
+          <w:rFonts w:ascii="Consolas" w:hAnsi="Consolas"/>
+          <w:color w:val="000000"/>
+          <w:sz w:val="14"/>
+        </w:rPr>
+        <w:t>152          print(f"  +/-{k} sigma  [{lo:6.2f}, {hi:6.2f}]  -&gt;  {dentro:2d}/{len(datos)} = "</w:t>
+      </w:r>
+    </w:p>
+    <w:p>
+      <w:pPr>
+        <w:spacing w:before="0" w:after="0" w:line="240" w:lineRule="auto"/>
+      </w:pPr>
+      <w:r>
+        <w:rPr>
+          <w:rFonts w:ascii="Consolas" w:hAnsi="Consolas"/>
+          <w:color w:val="000000"/>
+          <w:sz w:val="14"/>
+        </w:rPr>
+        <w:t>153                f"{dentro / len(datos) * 100:5.1f}%   (esperado {esperado[k]}%)")</w:t>
+      </w:r>
+    </w:p>
+    <w:p>
+      <w:pPr>
+        <w:spacing w:before="0" w:after="0" w:line="240" w:lineRule="auto"/>
+      </w:pPr>
+      <w:r>
+        <w:rPr>
+          <w:rFonts w:ascii="Consolas" w:hAnsi="Consolas"/>
+          <w:color w:val="000000"/>
+          <w:sz w:val="14"/>
+        </w:rPr>
+        <w:t xml:space="preserve">154  </w:t>
+      </w:r>
+    </w:p>
+    <w:p>
+      <w:pPr>
+        <w:spacing w:before="0" w:after="0" w:line="240" w:lineRule="auto"/>
+      </w:pPr>
+      <w:r>
+        <w:rPr>
+          <w:rFonts w:ascii="Consolas" w:hAnsi="Consolas"/>
+          <w:color w:val="000000"/>
+          <w:sz w:val="14"/>
+        </w:rPr>
+        <w:t xml:space="preserve">155  </w:t>
+      </w:r>
+    </w:p>
+    <w:p>
+      <w:pPr>
+        <w:spacing w:before="0" w:after="0" w:line="240" w:lineRule="auto"/>
+      </w:pPr>
+      <w:r>
+        <w:rPr>
+          <w:rFonts w:ascii="Consolas" w:hAnsi="Consolas"/>
+          <w:color w:val="000000"/>
+          <w:sz w:val="14"/>
+        </w:rPr>
+        <w:t>156  regla_empirica(tiempos_entrega, "datos completos")</w:t>
+      </w:r>
+    </w:p>
+    <w:p>
+      <w:pPr>
+        <w:spacing w:before="0" w:after="0" w:line="240" w:lineRule="auto"/>
+      </w:pPr>
+      <w:r>
+        <w:rPr>
+          <w:rFonts w:ascii="Consolas" w:hAnsi="Consolas"/>
+          <w:color w:val="000000"/>
+          <w:sz w:val="14"/>
+        </w:rPr>
+        <w:t xml:space="preserve">157  </w:t>
+      </w:r>
+    </w:p>
+    <w:p>
+      <w:pPr>
+        <w:spacing w:before="0" w:after="0" w:line="240" w:lineRule="auto"/>
+      </w:pPr>
+      <w:r>
+        <w:rPr>
+          <w:rFonts w:ascii="Consolas" w:hAnsi="Consolas"/>
+          <w:color w:val="000000"/>
+          <w:sz w:val="14"/>
+        </w:rPr>
+        <w:t xml:space="preserve">158  </w:t>
+      </w:r>
+    </w:p>
+    <w:p>
+      <w:pPr>
+        <w:spacing w:before="0" w:after="0" w:line="240" w:lineRule="auto"/>
+      </w:pPr>
+      <w:r>
+        <w:rPr>
+          <w:rFonts w:ascii="Consolas" w:hAnsi="Consolas"/>
+          <w:color w:val="000000"/>
+          <w:sz w:val="14"/>
+        </w:rPr>
+        <w:t>159  def cuartiles_iqr(datos):</w:t>
+      </w:r>
+    </w:p>
+    <w:p>
+      <w:pPr>
+        <w:spacing w:before="0" w:after="0" w:line="240" w:lineRule="auto"/>
+      </w:pPr>
+      <w:r>
+        <w:rPr>
+          <w:rFonts w:ascii="Consolas" w:hAnsi="Consolas"/>
+          <w:color w:val="000000"/>
+          <w:sz w:val="14"/>
+        </w:rPr>
+        <w:t>160      """Cuartiles por el metodo de la mediana de las mitades (excluyente)."""</w:t>
+      </w:r>
+    </w:p>
+    <w:p>
+      <w:pPr>
+        <w:spacing w:before="0" w:after="0" w:line="240" w:lineRule="auto"/>
+      </w:pPr>
+      <w:r>
+        <w:rPr>
+          <w:rFonts w:ascii="Consolas" w:hAnsi="Consolas"/>
+          <w:color w:val="000000"/>
+          <w:sz w:val="14"/>
+        </w:rPr>
+        <w:t>161      ordenados = sorted(datos)</w:t>
+      </w:r>
+    </w:p>
+    <w:p>
+      <w:pPr>
+        <w:spacing w:before="0" w:after="0" w:line="240" w:lineRule="auto"/>
+      </w:pPr>
+      <w:r>
+        <w:rPr>
+          <w:rFonts w:ascii="Consolas" w:hAnsi="Consolas"/>
+          <w:color w:val="000000"/>
+          <w:sz w:val="14"/>
+        </w:rPr>
+        <w:t>162      mitad = len(ordenados) // 2</w:t>
+      </w:r>
+    </w:p>
+    <w:p>
+      <w:pPr>
+        <w:spacing w:before="0" w:after="0" w:line="240" w:lineRule="auto"/>
+      </w:pPr>
+      <w:r>
+        <w:rPr>
+          <w:rFonts w:ascii="Consolas" w:hAnsi="Consolas"/>
+          <w:color w:val="000000"/>
+          <w:sz w:val="14"/>
+        </w:rPr>
+        <w:t>163      q1 = st.median(ordenados[:mitad])</w:t>
+      </w:r>
+    </w:p>
+    <w:p>
+      <w:pPr>
+        <w:spacing w:before="0" w:after="0" w:line="240" w:lineRule="auto"/>
+      </w:pPr>
+      <w:r>
+        <w:rPr>
+          <w:rFonts w:ascii="Consolas" w:hAnsi="Consolas"/>
+          <w:color w:val="000000"/>
+          <w:sz w:val="14"/>
+        </w:rPr>
+        <w:t>164      q3 = st.median(ordenados[mitad:])</w:t>
+      </w:r>
+    </w:p>
+    <w:p>
+      <w:pPr>
+        <w:spacing w:before="0" w:after="0" w:line="240" w:lineRule="auto"/>
+      </w:pPr>
+      <w:r>
+        <w:rPr>
+          <w:rFonts w:ascii="Consolas" w:hAnsi="Consolas"/>
+          <w:color w:val="000000"/>
+          <w:sz w:val="14"/>
+        </w:rPr>
+        <w:t>165      return q1, q3, q3 - q1</w:t>
+      </w:r>
+    </w:p>
+    <w:p>
+      <w:pPr>
+        <w:spacing w:before="0" w:after="0" w:line="240" w:lineRule="auto"/>
+      </w:pPr>
+      <w:r>
+        <w:rPr>
+          <w:rFonts w:ascii="Consolas" w:hAnsi="Consolas"/>
+          <w:color w:val="000000"/>
+          <w:sz w:val="14"/>
+        </w:rPr>
+        <w:t xml:space="preserve">166  </w:t>
+      </w:r>
+    </w:p>
+    <w:p>
+      <w:pPr>
+        <w:spacing w:before="0" w:after="0" w:line="240" w:lineRule="auto"/>
+      </w:pPr>
+      <w:r>
+        <w:rPr>
+          <w:rFonts w:ascii="Consolas" w:hAnsi="Consolas"/>
+          <w:color w:val="000000"/>
+          <w:sz w:val="14"/>
+        </w:rPr>
+        <w:t xml:space="preserve">167  </w:t>
+      </w:r>
+    </w:p>
+    <w:p>
+      <w:pPr>
+        <w:spacing w:before="0" w:after="0" w:line="240" w:lineRule="auto"/>
+      </w:pPr>
+      <w:r>
+        <w:rPr>
+          <w:rFonts w:ascii="Consolas" w:hAnsi="Consolas"/>
+          <w:color w:val="000000"/>
+          <w:sz w:val="14"/>
+        </w:rPr>
+        <w:t>168  q1, q3, iqr = cuartiles_iqr(tiempos_entrega)</w:t>
+      </w:r>
+    </w:p>
+    <w:p>
+      <w:pPr>
+        <w:spacing w:before="0" w:after="0" w:line="240" w:lineRule="auto"/>
+      </w:pPr>
+      <w:r>
+        <w:rPr>
+          <w:rFonts w:ascii="Consolas" w:hAnsi="Consolas"/>
+          <w:color w:val="000000"/>
+          <w:sz w:val="14"/>
+        </w:rPr>
+        <w:t>169  lim_inf, lim_sup = q1 - 1.5 * iqr, q3 + 1.5 * iqr</w:t>
+      </w:r>
+    </w:p>
+    <w:p>
+      <w:pPr>
+        <w:spacing w:before="0" w:after="0" w:line="240" w:lineRule="auto"/>
+      </w:pPr>
+      <w:r>
+        <w:rPr>
+          <w:rFonts w:ascii="Consolas" w:hAnsi="Consolas"/>
+          <w:color w:val="000000"/>
+          <w:sz w:val="14"/>
+        </w:rPr>
+        <w:t>170  atipicos = [x for x in tiempos_entrega if x &lt; lim_inf or x &gt; lim_sup]</w:t>
+      </w:r>
+    </w:p>
+    <w:p>
+      <w:pPr>
+        <w:spacing w:before="0" w:after="0" w:line="240" w:lineRule="auto"/>
+      </w:pPr>
+      <w:r>
+        <w:rPr>
+          <w:rFonts w:ascii="Consolas" w:hAnsi="Consolas"/>
+          <w:color w:val="000000"/>
+          <w:sz w:val="14"/>
+        </w:rPr>
+        <w:t>171  tiempos_limpios = [x for x in tiempos_entrega if lim_inf &lt;= x &lt;= lim_sup]</w:t>
+      </w:r>
+    </w:p>
+    <w:p>
+      <w:pPr>
+        <w:spacing w:before="0" w:after="0" w:line="240" w:lineRule="auto"/>
+      </w:pPr>
+      <w:r>
+        <w:rPr>
+          <w:rFonts w:ascii="Consolas" w:hAnsi="Consolas"/>
+          <w:color w:val="000000"/>
+          <w:sz w:val="14"/>
+        </w:rPr>
+        <w:t xml:space="preserve">172  </w:t>
+      </w:r>
+    </w:p>
+    <w:p>
+      <w:pPr>
+        <w:spacing w:before="0" w:after="0" w:line="240" w:lineRule="auto"/>
+      </w:pPr>
+      <w:r>
+        <w:rPr>
+          <w:rFonts w:ascii="Consolas" w:hAnsi="Consolas"/>
+          <w:color w:val="000000"/>
+          <w:sz w:val="14"/>
+        </w:rPr>
+        <w:t>173  print(f"\nMetodo IQR:  Q1 = {q1:.1f}   Q3 = {q3:.1f}   IQR = {iqr:.1f}")</w:t>
+      </w:r>
+    </w:p>
+    <w:p>
+      <w:pPr>
+        <w:spacing w:before="0" w:after="0" w:line="240" w:lineRule="auto"/>
+      </w:pPr>
+      <w:r>
+        <w:rPr>
+          <w:rFonts w:ascii="Consolas" w:hAnsi="Consolas"/>
+          <w:color w:val="000000"/>
+          <w:sz w:val="14"/>
+        </w:rPr>
+        <w:t>174  print(f"  Limite inferior Q1 - 1.5*IQR = {lim_inf:.1f} min")</w:t>
+      </w:r>
+    </w:p>
+    <w:p>
+      <w:pPr>
+        <w:spacing w:before="0" w:after="0" w:line="240" w:lineRule="auto"/>
+      </w:pPr>
+      <w:r>
+        <w:rPr>
+          <w:rFonts w:ascii="Consolas" w:hAnsi="Consolas"/>
+          <w:color w:val="000000"/>
+          <w:sz w:val="14"/>
+        </w:rPr>
+        <w:t>175  print(f"  Limite superior Q3 + 1.5*IQR = {lim_sup:.1f} min")</w:t>
+      </w:r>
+    </w:p>
+    <w:p>
+      <w:pPr>
+        <w:spacing w:before="0" w:after="0" w:line="240" w:lineRule="auto"/>
+      </w:pPr>
+      <w:r>
+        <w:rPr>
+          <w:rFonts w:ascii="Consolas" w:hAnsi="Consolas"/>
+          <w:color w:val="000000"/>
+          <w:sz w:val="14"/>
+        </w:rPr>
+        <w:t>176  print(f"  Valores atipicos detectados  = {atipicos}")</w:t>
+      </w:r>
+    </w:p>
+    <w:p>
+      <w:pPr>
+        <w:spacing w:before="0" w:after="0" w:line="240" w:lineRule="auto"/>
+      </w:pPr>
+      <w:r>
+        <w:rPr>
+          <w:rFonts w:ascii="Consolas" w:hAnsi="Consolas"/>
+          <w:color w:val="000000"/>
+          <w:sz w:val="14"/>
+        </w:rPr>
+        <w:t>177  print(f"  Serie depurada: n = {len(tiempos_limpios)} pedidos")</w:t>
+      </w:r>
+    </w:p>
+    <w:p>
+      <w:pPr>
+        <w:spacing w:before="0" w:after="0" w:line="240" w:lineRule="auto"/>
+      </w:pPr>
+      <w:r>
+        <w:rPr>
+          <w:rFonts w:ascii="Consolas" w:hAnsi="Consolas"/>
+          <w:color w:val="000000"/>
+          <w:sz w:val="14"/>
+        </w:rPr>
+        <w:t xml:space="preserve">178  </w:t>
+      </w:r>
+    </w:p>
+    <w:p>
+      <w:pPr>
+        <w:spacing w:before="0" w:after="0" w:line="240" w:lineRule="auto"/>
+      </w:pPr>
+      <w:r>
+        <w:rPr>
+          <w:rFonts w:ascii="Consolas" w:hAnsi="Consolas"/>
+          <w:color w:val="000000"/>
+          <w:sz w:val="14"/>
+        </w:rPr>
+        <w:t>179  L = descriptivos(tiempos_limpios, "Dataset B depurado (sin atipicos)", "min")</w:t>
+      </w:r>
+    </w:p>
+    <w:p>
+      <w:pPr>
+        <w:spacing w:before="0" w:after="0" w:line="240" w:lineRule="auto"/>
+      </w:pPr>
+      <w:r>
+        <w:rPr>
+          <w:rFonts w:ascii="Consolas" w:hAnsi="Consolas"/>
+          <w:color w:val="000000"/>
+          <w:sz w:val="14"/>
+        </w:rPr>
+        <w:t>180  regla_empirica(tiempos_limpios, "datos depurados")</w:t>
+      </w:r>
+    </w:p>
+    <w:p>
+      <w:pPr>
+        <w:spacing w:before="0" w:after="0" w:line="240" w:lineRule="auto"/>
+      </w:pPr>
+      <w:r>
+        <w:rPr>
+          <w:rFonts w:ascii="Consolas" w:hAnsi="Consolas"/>
+          <w:color w:val="000000"/>
+          <w:sz w:val="14"/>
+        </w:rPr>
+        <w:t xml:space="preserve">181  </w:t>
+      </w:r>
+    </w:p>
+    <w:p>
+      <w:pPr>
+        <w:spacing w:before="0" w:after="0" w:line="240" w:lineRule="auto"/>
+      </w:pPr>
+      <w:r>
+        <w:rPr>
+          <w:rFonts w:ascii="Consolas" w:hAnsi="Consolas"/>
+          <w:color w:val="000000"/>
+          <w:sz w:val="14"/>
+        </w:rPr>
+        <w:t>182  # Tiempo de garantia: percentil 90 de la Normal ajustada a los datos depurados.</w:t>
+      </w:r>
+    </w:p>
+    <w:p>
+      <w:pPr>
+        <w:spacing w:before="0" w:after="0" w:line="240" w:lineRule="auto"/>
+      </w:pPr>
+      <w:r>
+        <w:rPr>
+          <w:rFonts w:ascii="Consolas" w:hAnsi="Consolas"/>
+          <w:color w:val="000000"/>
+          <w:sz w:val="14"/>
+        </w:rPr>
+        <w:t>183  z90 = st.NormalDist().inv_cdf(0.90)</w:t>
+      </w:r>
+    </w:p>
+    <w:p>
+      <w:pPr>
+        <w:spacing w:before="0" w:after="0" w:line="240" w:lineRule="auto"/>
+      </w:pPr>
+      <w:r>
+        <w:rPr>
+          <w:rFonts w:ascii="Consolas" w:hAnsi="Consolas"/>
+          <w:color w:val="000000"/>
+          <w:sz w:val="14"/>
+        </w:rPr>
+        <w:t>184  x_garantia = L["media"] + z90 * L["sd_pob"]</w:t>
+      </w:r>
+    </w:p>
+    <w:p>
+      <w:pPr>
+        <w:spacing w:before="0" w:after="0" w:line="240" w:lineRule="auto"/>
+      </w:pPr>
+      <w:r>
+        <w:rPr>
+          <w:rFonts w:ascii="Consolas" w:hAnsi="Consolas"/>
+          <w:color w:val="000000"/>
+          <w:sz w:val="14"/>
+        </w:rPr>
+        <w:t>185  print(f"\nz para el percentil 90 = {z90:.4f}")</w:t>
+      </w:r>
+    </w:p>
+    <w:p>
+      <w:pPr>
+        <w:spacing w:before="0" w:after="0" w:line="240" w:lineRule="auto"/>
+      </w:pPr>
+      <w:r>
+        <w:rPr>
+          <w:rFonts w:ascii="Consolas" w:hAnsi="Consolas"/>
+          <w:color w:val="000000"/>
+          <w:sz w:val="14"/>
+        </w:rPr>
+        <w:t>186  print(f"X = media + z*sigma = {L['media']:.4f} + {z90:.4f} * {L['sd_pob']:.4f} = {x_garantia:.4f} min")</w:t>
+      </w:r>
+    </w:p>
+    <w:p>
+      <w:pPr>
+        <w:spacing w:before="0" w:after="0" w:line="240" w:lineRule="auto"/>
+      </w:pPr>
+      <w:r>
+        <w:rPr>
+          <w:rFonts w:ascii="Consolas" w:hAnsi="Consolas"/>
+          <w:color w:val="000000"/>
+          <w:sz w:val="14"/>
+        </w:rPr>
+        <w:t xml:space="preserve">187  </w:t>
+      </w:r>
+    </w:p>
+    <w:p>
+      <w:pPr>
+        <w:spacing w:before="0" w:after="0" w:line="240" w:lineRule="auto"/>
+      </w:pPr>
+      <w:r>
+        <w:rPr>
+          <w:rFonts w:ascii="Consolas" w:hAnsi="Consolas"/>
+          <w:color w:val="000000"/>
+          <w:sz w:val="14"/>
+        </w:rPr>
+        <w:t>188  normal_limpia = st.NormalDist(mu=L["media"], sigma=L["sd_pob"])</w:t>
+      </w:r>
+    </w:p>
+    <w:p>
+      <w:pPr>
+        <w:spacing w:before="0" w:after="0" w:line="240" w:lineRule="auto"/>
+      </w:pPr>
+      <w:r>
+        <w:rPr>
+          <w:rFonts w:ascii="Consolas" w:hAnsi="Consolas"/>
+          <w:color w:val="000000"/>
+          <w:sz w:val="14"/>
+        </w:rPr>
+        <w:t>189  print("\nCumplimiento segun el valor prometido:")</w:t>
+      </w:r>
+    </w:p>
+    <w:p>
+      <w:pPr>
+        <w:spacing w:before="0" w:after="0" w:line="240" w:lineRule="auto"/>
+      </w:pPr>
+      <w:r>
+        <w:rPr>
+          <w:rFonts w:ascii="Consolas" w:hAnsi="Consolas"/>
+          <w:color w:val="000000"/>
+          <w:sz w:val="14"/>
+        </w:rPr>
+        <w:t>190  for x in (37, 38, 39, 40):</w:t>
+      </w:r>
+    </w:p>
+    <w:p>
+      <w:pPr>
+        <w:spacing w:before="0" w:after="0" w:line="240" w:lineRule="auto"/>
+      </w:pPr>
+      <w:r>
+        <w:rPr>
+          <w:rFonts w:ascii="Consolas" w:hAnsi="Consolas"/>
+          <w:color w:val="000000"/>
+          <w:sz w:val="14"/>
+        </w:rPr>
+        <w:t>191      teorico = normal_limpia.cdf(x)</w:t>
+      </w:r>
+    </w:p>
+    <w:p>
+      <w:pPr>
+        <w:spacing w:before="0" w:after="0" w:line="240" w:lineRule="auto"/>
+      </w:pPr>
+      <w:r>
+        <w:rPr>
+          <w:rFonts w:ascii="Consolas" w:hAnsi="Consolas"/>
+          <w:color w:val="000000"/>
+          <w:sz w:val="14"/>
+        </w:rPr>
+        <w:t>192      emp_limpio = sum(1 for t in tiempos_limpios if t &lt;= x) / len(tiempos_limpios)</w:t>
+      </w:r>
+    </w:p>
+    <w:p>
+      <w:pPr>
+        <w:spacing w:before="0" w:after="0" w:line="240" w:lineRule="auto"/>
+      </w:pPr>
+      <w:r>
+        <w:rPr>
+          <w:rFonts w:ascii="Consolas" w:hAnsi="Consolas"/>
+          <w:color w:val="000000"/>
+          <w:sz w:val="14"/>
+        </w:rPr>
+        <w:t>193      emp_total = sum(1 for t in tiempos_entrega if t &lt;= x) / len(tiempos_entrega)</w:t>
+      </w:r>
+    </w:p>
+    <w:p>
+      <w:pPr>
+        <w:spacing w:before="0" w:after="0" w:line="240" w:lineRule="auto"/>
+      </w:pPr>
+      <w:r>
+        <w:rPr>
+          <w:rFonts w:ascii="Consolas" w:hAnsi="Consolas"/>
+          <w:color w:val="000000"/>
+          <w:sz w:val="14"/>
+        </w:rPr>
+        <w:t>194      print(f"  X = {x} min -&gt; teorico {teorico * 100:5.2f}%   empirico depurado "</w:t>
+      </w:r>
+    </w:p>
+    <w:p>
+      <w:pPr>
+        <w:spacing w:before="0" w:after="0" w:line="240" w:lineRule="auto"/>
+      </w:pPr>
+      <w:r>
+        <w:rPr>
+          <w:rFonts w:ascii="Consolas" w:hAnsi="Consolas"/>
+          <w:color w:val="000000"/>
+          <w:sz w:val="14"/>
+        </w:rPr>
+        <w:t>195            f"{emp_limpio * 100:5.2f}%   empirico con atipicos {emp_total * 100:5.2f}%")</w:t>
+      </w:r>
+    </w:p>
+    <w:p>
+      <w:pPr>
+        <w:spacing w:before="0" w:after="0" w:line="240" w:lineRule="auto"/>
+      </w:pPr>
+      <w:r>
+        <w:rPr>
+          <w:rFonts w:ascii="Consolas" w:hAnsi="Consolas"/>
+          <w:color w:val="000000"/>
+          <w:sz w:val="14"/>
+        </w:rPr>
+        <w:t xml:space="preserve">196  </w:t>
+      </w:r>
+    </w:p>
+    <w:p>
+      <w:pPr>
+        <w:spacing w:before="0" w:after="0" w:line="240" w:lineRule="auto"/>
+      </w:pPr>
+      <w:r>
+        <w:rPr>
+          <w:rFonts w:ascii="Consolas" w:hAnsi="Consolas"/>
+          <w:color w:val="000000"/>
+          <w:sz w:val="14"/>
+        </w:rPr>
+        <w:t>197  print(f"\nRecomendacion: prometer {38} minutos "</w:t>
+      </w:r>
+    </w:p>
+    <w:p>
+      <w:pPr>
+        <w:spacing w:before="0" w:after="0" w:line="240" w:lineRule="auto"/>
+      </w:pPr>
+      <w:r>
+        <w:rPr>
+          <w:rFonts w:ascii="Consolas" w:hAnsi="Consolas"/>
+          <w:color w:val="000000"/>
+          <w:sz w:val="14"/>
+        </w:rPr>
+        <w:t>198        f"(incumplimiento teorico {(1 - normal_limpia.cdf(38)) * 100:.2f}%, "</w:t>
+      </w:r>
+    </w:p>
+    <w:p>
+      <w:pPr>
+        <w:spacing w:before="0" w:after="0" w:line="240" w:lineRule="auto"/>
+      </w:pPr>
+      <w:r>
+        <w:rPr>
+          <w:rFonts w:ascii="Consolas" w:hAnsi="Consolas"/>
+          <w:color w:val="000000"/>
+          <w:sz w:val="14"/>
+        </w:rPr>
+        <w:t>199        f"real observado {sum(1 for t in tiempos_entrega if t &gt; 38) / len(tiempos_entrega) * 100:.2f}%).")</w:t>
+      </w:r>
+    </w:p>
+    <w:p>
+      <w:pPr>
+        <w:spacing w:before="0" w:after="0" w:line="240" w:lineRule="auto"/>
+      </w:pPr>
+      <w:r>
+        <w:rPr>
+          <w:rFonts w:ascii="Consolas" w:hAnsi="Consolas"/>
+          <w:color w:val="000000"/>
+          <w:sz w:val="14"/>
+        </w:rPr>
+        <w:t xml:space="preserve">200  </w:t>
+      </w:r>
+    </w:p>
+    <w:p>
+      <w:pPr>
+        <w:spacing w:before="0" w:after="0" w:line="240" w:lineRule="auto"/>
+      </w:pPr>
+      <w:r>
+        <w:rPr>
+          <w:rFonts w:ascii="Consolas" w:hAnsi="Consolas"/>
+          <w:color w:val="000000"/>
+          <w:sz w:val="14"/>
+        </w:rPr>
+        <w:t xml:space="preserve">201  </w:t>
+      </w:r>
+    </w:p>
+    <w:p>
+      <w:pPr>
+        <w:spacing w:before="0" w:after="0" w:line="240" w:lineRule="auto"/>
+      </w:pPr>
+      <w:r>
+        <w:rPr>
+          <w:rFonts w:ascii="Consolas" w:hAnsi="Consolas"/>
+          <w:color w:val="000000"/>
+          <w:sz w:val="14"/>
+        </w:rPr>
+        <w:t>202  # =====================================================================</w:t>
+      </w:r>
+    </w:p>
+    <w:p>
+      <w:pPr>
+        <w:spacing w:before="0" w:after="0" w:line="240" w:lineRule="auto"/>
+      </w:pPr>
+      <w:r>
+        <w:rPr>
+          <w:rFonts w:ascii="Consolas" w:hAnsi="Consolas"/>
+          <w:color w:val="000000"/>
+          <w:sz w:val="14"/>
+        </w:rPr>
+        <w:t>203  # TAREA 5 - VISUALIZACION</w:t>
+      </w:r>
+    </w:p>
+    <w:p>
+      <w:pPr>
+        <w:spacing w:before="0" w:after="0" w:line="240" w:lineRule="auto"/>
+      </w:pPr>
+      <w:r>
+        <w:rPr>
+          <w:rFonts w:ascii="Consolas" w:hAnsi="Consolas"/>
+          <w:color w:val="000000"/>
+          <w:sz w:val="14"/>
+        </w:rPr>
+        <w:t>204  # =====================================================================</w:t>
+      </w:r>
+    </w:p>
+    <w:p>
+      <w:pPr>
+        <w:spacing w:before="0" w:after="0" w:line="240" w:lineRule="auto"/>
+      </w:pPr>
+      <w:r>
+        <w:rPr>
+          <w:rFonts w:ascii="Consolas" w:hAnsi="Consolas"/>
+          <w:color w:val="000000"/>
+          <w:sz w:val="14"/>
+        </w:rPr>
+        <w:t xml:space="preserve">205  </w:t>
+      </w:r>
+    </w:p>
+    <w:p>
+      <w:pPr>
+        <w:spacing w:before="0" w:after="0" w:line="240" w:lineRule="auto"/>
+      </w:pPr>
+      <w:r>
+        <w:rPr>
+          <w:rFonts w:ascii="Consolas" w:hAnsi="Consolas"/>
+          <w:color w:val="000000"/>
+          <w:sz w:val="14"/>
+        </w:rPr>
+        <w:t>206  def graficar():</w:t>
+      </w:r>
+    </w:p>
+    <w:p>
+      <w:pPr>
+        <w:spacing w:before="0" w:after="0" w:line="240" w:lineRule="auto"/>
+      </w:pPr>
+      <w:r>
+        <w:rPr>
+          <w:rFonts w:ascii="Consolas" w:hAnsi="Consolas"/>
+          <w:color w:val="000000"/>
+          <w:sz w:val="14"/>
+        </w:rPr>
+        <w:t>207      """Genera los graficos del reporte. Requiere matplotlib."""</w:t>
+      </w:r>
+    </w:p>
+    <w:p>
+      <w:pPr>
+        <w:spacing w:before="0" w:after="0" w:line="240" w:lineRule="auto"/>
+      </w:pPr>
+      <w:r>
+        <w:rPr>
+          <w:rFonts w:ascii="Consolas" w:hAnsi="Consolas"/>
+          <w:color w:val="000000"/>
+          <w:sz w:val="14"/>
+        </w:rPr>
+        <w:t>208      try:</w:t>
+      </w:r>
+    </w:p>
+    <w:p>
+      <w:pPr>
+        <w:spacing w:before="0" w:after="0" w:line="240" w:lineRule="auto"/>
+      </w:pPr>
+      <w:r>
+        <w:rPr>
+          <w:rFonts w:ascii="Consolas" w:hAnsi="Consolas"/>
+          <w:color w:val="000000"/>
+          <w:sz w:val="14"/>
+        </w:rPr>
+        <w:t>209          import matplotlib</w:t>
+      </w:r>
+    </w:p>
+    <w:p>
+      <w:pPr>
+        <w:spacing w:before="0" w:after="0" w:line="240" w:lineRule="auto"/>
+      </w:pPr>
+      <w:r>
+        <w:rPr>
+          <w:rFonts w:ascii="Consolas" w:hAnsi="Consolas"/>
+          <w:color w:val="000000"/>
+          <w:sz w:val="14"/>
+        </w:rPr>
+        <w:t>210          matplotlib.use("Agg")</w:t>
+      </w:r>
+    </w:p>
+    <w:p>
+      <w:pPr>
+        <w:spacing w:before="0" w:after="0" w:line="240" w:lineRule="auto"/>
+      </w:pPr>
+      <w:r>
+        <w:rPr>
+          <w:rFonts w:ascii="Consolas" w:hAnsi="Consolas"/>
+          <w:color w:val="000000"/>
+          <w:sz w:val="14"/>
+        </w:rPr>
+        <w:t>211          import matplotlib.pyplot as plt</w:t>
+      </w:r>
+    </w:p>
+    <w:p>
+      <w:pPr>
+        <w:spacing w:before="0" w:after="0" w:line="240" w:lineRule="auto"/>
+      </w:pPr>
+      <w:r>
+        <w:rPr>
+          <w:rFonts w:ascii="Consolas" w:hAnsi="Consolas"/>
+          <w:color w:val="000000"/>
+          <w:sz w:val="14"/>
+        </w:rPr>
+        <w:t>212      except ImportError:</w:t>
+      </w:r>
+    </w:p>
+    <w:p>
+      <w:pPr>
+        <w:spacing w:before="0" w:after="0" w:line="240" w:lineRule="auto"/>
+      </w:pPr>
+      <w:r>
+        <w:rPr>
+          <w:rFonts w:ascii="Consolas" w:hAnsi="Consolas"/>
+          <w:color w:val="000000"/>
+          <w:sz w:val="14"/>
+        </w:rPr>
+        <w:t>213          print("\n[matplotlib no instalado: se omiten los graficos]")</w:t>
+      </w:r>
+    </w:p>
+    <w:p>
+      <w:pPr>
+        <w:spacing w:before="0" w:after="0" w:line="240" w:lineRule="auto"/>
+      </w:pPr>
+      <w:r>
+        <w:rPr>
+          <w:rFonts w:ascii="Consolas" w:hAnsi="Consolas"/>
+          <w:color w:val="000000"/>
+          <w:sz w:val="14"/>
+        </w:rPr>
+        <w:t>214          return</w:t>
+      </w:r>
+    </w:p>
+    <w:p>
+      <w:pPr>
+        <w:spacing w:before="0" w:after="0" w:line="240" w:lineRule="auto"/>
+      </w:pPr>
+      <w:r>
+        <w:rPr>
+          <w:rFonts w:ascii="Consolas" w:hAnsi="Consolas"/>
+          <w:color w:val="000000"/>
+          <w:sz w:val="14"/>
+        </w:rPr>
+        <w:t xml:space="preserve">215  </w:t>
+      </w:r>
+    </w:p>
+    <w:p>
+      <w:pPr>
+        <w:spacing w:before="0" w:after="0" w:line="240" w:lineRule="auto"/>
+      </w:pPr>
+      <w:r>
+        <w:rPr>
+          <w:rFonts w:ascii="Consolas" w:hAnsi="Consolas"/>
+          <w:color w:val="000000"/>
+          <w:sz w:val="14"/>
+        </w:rPr>
+        <w:t>216      # Paleta institucional Key</w:t>
+      </w:r>
+    </w:p>
+    <w:p>
+      <w:pPr>
+        <w:spacing w:before="0" w:after="0" w:line="240" w:lineRule="auto"/>
+      </w:pPr>
+      <w:r>
+        <w:rPr>
+          <w:rFonts w:ascii="Consolas" w:hAnsi="Consolas"/>
+          <w:color w:val="000000"/>
+          <w:sz w:val="14"/>
+        </w:rPr>
+        <w:t>217      AZUL, MORADO, NEGRO = "#006FFF", "#9746FF", "#000000"</w:t>
+      </w:r>
+    </w:p>
+    <w:p>
+      <w:pPr>
+        <w:spacing w:before="0" w:after="0" w:line="240" w:lineRule="auto"/>
+      </w:pPr>
+      <w:r>
+        <w:rPr>
+          <w:rFonts w:ascii="Consolas" w:hAnsi="Consolas"/>
+          <w:color w:val="000000"/>
+          <w:sz w:val="14"/>
+        </w:rPr>
+        <w:t>218      VERDE, AMARILLO, GRIS = "#00E379", "#F3F300", "#7E7D8A"</w:t>
+      </w:r>
+    </w:p>
+    <w:p>
+      <w:pPr>
+        <w:spacing w:before="0" w:after="0" w:line="240" w:lineRule="auto"/>
+      </w:pPr>
+      <w:r>
+        <w:rPr>
+          <w:rFonts w:ascii="Consolas" w:hAnsi="Consolas"/>
+          <w:color w:val="000000"/>
+          <w:sz w:val="14"/>
+        </w:rPr>
+        <w:t>219      TINTA, ACENTO, RIESGO = AZUL, MORADO, NEGRO</w:t>
+      </w:r>
+    </w:p>
+    <w:p>
+      <w:pPr>
+        <w:spacing w:before="0" w:after="0" w:line="240" w:lineRule="auto"/>
+      </w:pPr>
+      <w:r>
+        <w:rPr>
+          <w:rFonts w:ascii="Consolas" w:hAnsi="Consolas"/>
+          <w:color w:val="000000"/>
+          <w:sz w:val="14"/>
+        </w:rPr>
+        <w:t xml:space="preserve">220  </w:t>
+      </w:r>
+    </w:p>
+    <w:p>
+      <w:pPr>
+        <w:spacing w:before="0" w:after="0" w:line="240" w:lineRule="auto"/>
+      </w:pPr>
+      <w:r>
+        <w:rPr>
+          <w:rFonts w:ascii="Consolas" w:hAnsi="Consolas"/>
+          <w:color w:val="000000"/>
+          <w:sz w:val="14"/>
+        </w:rPr>
+        <w:t>221      # Grafico 1: frecuencia observada vs modelo binomial</w:t>
+      </w:r>
+    </w:p>
+    <w:p>
+      <w:pPr>
+        <w:spacing w:before="0" w:after="0" w:line="240" w:lineRule="auto"/>
+      </w:pPr>
+      <w:r>
+        <w:rPr>
+          <w:rFonts w:ascii="Consolas" w:hAnsi="Consolas"/>
+          <w:color w:val="000000"/>
+          <w:sz w:val="14"/>
+        </w:rPr>
+        <w:t>222      fig, ax = plt.subplots(figsize=(7.2, 3.6))</w:t>
+      </w:r>
+    </w:p>
+    <w:p>
+      <w:pPr>
+        <w:spacing w:before="0" w:after="0" w:line="240" w:lineRule="auto"/>
+      </w:pPr>
+      <w:r>
+        <w:rPr>
+          <w:rFonts w:ascii="Consolas" w:hAnsi="Consolas"/>
+          <w:color w:val="000000"/>
+          <w:sz w:val="14"/>
+        </w:rPr>
+        <w:t>223      ks = list(range(13))</w:t>
+      </w:r>
+    </w:p>
+    <w:p>
+      <w:pPr>
+        <w:spacing w:before="0" w:after="0" w:line="240" w:lineRule="auto"/>
+      </w:pPr>
+      <w:r>
+        <w:rPr>
+          <w:rFonts w:ascii="Consolas" w:hAnsi="Consolas"/>
+          <w:color w:val="000000"/>
+          <w:sz w:val="14"/>
+        </w:rPr>
+        <w:t>224      obs = [frec_A.get(k, 0) / len(compras_completadas) for k in ks]</w:t>
+      </w:r>
+    </w:p>
+    <w:p>
+      <w:pPr>
+        <w:spacing w:before="0" w:after="0" w:line="240" w:lineRule="auto"/>
+      </w:pPr>
+      <w:r>
+        <w:rPr>
+          <w:rFonts w:ascii="Consolas" w:hAnsi="Consolas"/>
+          <w:color w:val="000000"/>
+          <w:sz w:val="14"/>
+        </w:rPr>
+        <w:t>225      teo = [binom_pmf(k, n, p) for k in ks]</w:t>
+      </w:r>
+    </w:p>
+    <w:p>
+      <w:pPr>
+        <w:spacing w:before="0" w:after="0" w:line="240" w:lineRule="auto"/>
+      </w:pPr>
+      <w:r>
+        <w:rPr>
+          <w:rFonts w:ascii="Consolas" w:hAnsi="Consolas"/>
+          <w:color w:val="000000"/>
+          <w:sz w:val="14"/>
+        </w:rPr>
+        <w:t>226      ancho = 0.42</w:t>
+      </w:r>
+    </w:p>
+    <w:p>
+      <w:pPr>
+        <w:spacing w:before="0" w:after="0" w:line="240" w:lineRule="auto"/>
+      </w:pPr>
+      <w:r>
+        <w:rPr>
+          <w:rFonts w:ascii="Consolas" w:hAnsi="Consolas"/>
+          <w:color w:val="000000"/>
+          <w:sz w:val="14"/>
+        </w:rPr>
+        <w:t>227      ax.bar([k - ancho / 2 for k in ks], obs, ancho, color=TINTA, label="Observado (30 dias)")</w:t>
+      </w:r>
+    </w:p>
+    <w:p>
+      <w:pPr>
+        <w:spacing w:before="0" w:after="0" w:line="240" w:lineRule="auto"/>
+      </w:pPr>
+      <w:r>
+        <w:rPr>
+          <w:rFonts w:ascii="Consolas" w:hAnsi="Consolas"/>
+          <w:color w:val="000000"/>
+          <w:sz w:val="14"/>
+        </w:rPr>
+        <w:t>228      ax.bar([k + ancho / 2 for k in ks], teo, ancho, color=ACENTO, label="Binomial(12, 0.65)")</w:t>
+      </w:r>
+    </w:p>
+    <w:p>
+      <w:pPr>
+        <w:spacing w:before="0" w:after="0" w:line="240" w:lineRule="auto"/>
+      </w:pPr>
+      <w:r>
+        <w:rPr>
+          <w:rFonts w:ascii="Consolas" w:hAnsi="Consolas"/>
+          <w:color w:val="000000"/>
+          <w:sz w:val="14"/>
+        </w:rPr>
+        <w:t>229      ax.axvline(8.5, color=RIESGO, linestyle="--", linewidth=1.2)</w:t>
+      </w:r>
+    </w:p>
+    <w:p>
+      <w:pPr>
+        <w:spacing w:before="0" w:after="0" w:line="240" w:lineRule="auto"/>
+      </w:pPr>
+      <w:r>
+        <w:rPr>
+          <w:rFonts w:ascii="Consolas" w:hAnsi="Consolas"/>
+          <w:color w:val="000000"/>
+          <w:sz w:val="14"/>
+        </w:rPr>
+        <w:t>230      ax.text(8.65, max(max(obs), max(teo)) * 0.55, "X &gt; 8", color=RIESGO, fontsize=9)</w:t>
+      </w:r>
+    </w:p>
+    <w:p>
+      <w:pPr>
+        <w:spacing w:before="0" w:after="0" w:line="240" w:lineRule="auto"/>
+      </w:pPr>
+      <w:r>
+        <w:rPr>
+          <w:rFonts w:ascii="Consolas" w:hAnsi="Consolas"/>
+          <w:color w:val="000000"/>
+          <w:sz w:val="14"/>
+        </w:rPr>
+        <w:t>231      ax.set_xlabel("Clientes que completan compra en el turno")</w:t>
+      </w:r>
+    </w:p>
+    <w:p>
+      <w:pPr>
+        <w:spacing w:before="0" w:after="0" w:line="240" w:lineRule="auto"/>
+      </w:pPr>
+      <w:r>
+        <w:rPr>
+          <w:rFonts w:ascii="Consolas" w:hAnsi="Consolas"/>
+          <w:color w:val="000000"/>
+          <w:sz w:val="14"/>
+        </w:rPr>
+        <w:t>232      ax.set_ylabel("Probabilidad / frecuencia relativa")</w:t>
+      </w:r>
+    </w:p>
+    <w:p>
+      <w:pPr>
+        <w:spacing w:before="0" w:after="0" w:line="240" w:lineRule="auto"/>
+      </w:pPr>
+      <w:r>
+        <w:rPr>
+          <w:rFonts w:ascii="Consolas" w:hAnsi="Consolas"/>
+          <w:color w:val="000000"/>
+          <w:sz w:val="14"/>
+        </w:rPr>
+        <w:t>233      ax.set_xticks(ks)</w:t>
+      </w:r>
+    </w:p>
+    <w:p>
+      <w:pPr>
+        <w:spacing w:before="0" w:after="0" w:line="240" w:lineRule="auto"/>
+      </w:pPr>
+      <w:r>
+        <w:rPr>
+          <w:rFonts w:ascii="Consolas" w:hAnsi="Consolas"/>
+          <w:color w:val="000000"/>
+          <w:sz w:val="14"/>
+        </w:rPr>
+        <w:t>234      ax.legend(frameon=False, fontsize=8, loc="upper left")</w:t>
+      </w:r>
+    </w:p>
+    <w:p>
+      <w:pPr>
+        <w:spacing w:before="0" w:after="0" w:line="240" w:lineRule="auto"/>
+      </w:pPr>
+      <w:r>
+        <w:rPr>
+          <w:rFonts w:ascii="Consolas" w:hAnsi="Consolas"/>
+          <w:color w:val="000000"/>
+          <w:sz w:val="14"/>
+        </w:rPr>
+        <w:t>235      ax.spines[["top", "right"]].set_visible(False)</w:t>
+      </w:r>
+    </w:p>
+    <w:p>
+      <w:pPr>
+        <w:spacing w:before="0" w:after="0" w:line="240" w:lineRule="auto"/>
+      </w:pPr>
+      <w:r>
+        <w:rPr>
+          <w:rFonts w:ascii="Consolas" w:hAnsi="Consolas"/>
+          <w:color w:val="000000"/>
+          <w:sz w:val="14"/>
+        </w:rPr>
+        <w:t>236      fig.tight_layout()</w:t>
+      </w:r>
+    </w:p>
+    <w:p>
+      <w:pPr>
+        <w:spacing w:before="0" w:after="0" w:line="240" w:lineRule="auto"/>
+      </w:pPr>
+      <w:r>
+        <w:rPr>
+          <w:rFonts w:ascii="Consolas" w:hAnsi="Consolas"/>
+          <w:color w:val="000000"/>
+          <w:sz w:val="14"/>
+        </w:rPr>
+        <w:t>237      fig.savefig("grafico_binomial.png", dpi=170)</w:t>
+      </w:r>
+    </w:p>
+    <w:p>
+      <w:pPr>
+        <w:spacing w:before="0" w:after="0" w:line="240" w:lineRule="auto"/>
+      </w:pPr>
+      <w:r>
+        <w:rPr>
+          <w:rFonts w:ascii="Consolas" w:hAnsi="Consolas"/>
+          <w:color w:val="000000"/>
+          <w:sz w:val="14"/>
+        </w:rPr>
+        <w:t>238      plt.close(fig)</w:t>
+      </w:r>
+    </w:p>
+    <w:p>
+      <w:pPr>
+        <w:spacing w:before="0" w:after="0" w:line="240" w:lineRule="auto"/>
+      </w:pPr>
+      <w:r>
+        <w:rPr>
+          <w:rFonts w:ascii="Consolas" w:hAnsi="Consolas"/>
+          <w:color w:val="000000"/>
+          <w:sz w:val="14"/>
+        </w:rPr>
+        <w:t xml:space="preserve">239  </w:t>
+      </w:r>
+    </w:p>
+    <w:p>
+      <w:pPr>
+        <w:spacing w:before="0" w:after="0" w:line="240" w:lineRule="auto"/>
+      </w:pPr>
+      <w:r>
+        <w:rPr>
+          <w:rFonts w:ascii="Consolas" w:hAnsi="Consolas"/>
+          <w:color w:val="000000"/>
+          <w:sz w:val="14"/>
+        </w:rPr>
+        <w:t>240      # Grafico 2: histograma de tiempos con curva normal ajustada</w:t>
+      </w:r>
+    </w:p>
+    <w:p>
+      <w:pPr>
+        <w:spacing w:before="0" w:after="0" w:line="240" w:lineRule="auto"/>
+      </w:pPr>
+      <w:r>
+        <w:rPr>
+          <w:rFonts w:ascii="Consolas" w:hAnsi="Consolas"/>
+          <w:color w:val="000000"/>
+          <w:sz w:val="14"/>
+        </w:rPr>
+        <w:t>241      fig, ax = plt.subplots(figsize=(7.2, 3.6))</w:t>
+      </w:r>
+    </w:p>
+    <w:p>
+      <w:pPr>
+        <w:spacing w:before="0" w:after="0" w:line="240" w:lineRule="auto"/>
+      </w:pPr>
+      <w:r>
+        <w:rPr>
+          <w:rFonts w:ascii="Consolas" w:hAnsi="Consolas"/>
+          <w:color w:val="000000"/>
+          <w:sz w:val="14"/>
+        </w:rPr>
+        <w:t>242      ax.hist(tiempos_entrega, bins=range(5, 70, 5), density=True,</w:t>
+      </w:r>
+    </w:p>
+    <w:p>
+      <w:pPr>
+        <w:spacing w:before="0" w:after="0" w:line="240" w:lineRule="auto"/>
+      </w:pPr>
+      <w:r>
+        <w:rPr>
+          <w:rFonts w:ascii="Consolas" w:hAnsi="Consolas"/>
+          <w:color w:val="000000"/>
+          <w:sz w:val="14"/>
+        </w:rPr>
+        <w:t>243              color=TINTA, alpha=0.78, edgecolor="white")</w:t>
+      </w:r>
+    </w:p>
+    <w:p>
+      <w:pPr>
+        <w:spacing w:before="0" w:after="0" w:line="240" w:lineRule="auto"/>
+      </w:pPr>
+      <w:r>
+        <w:rPr>
+          <w:rFonts w:ascii="Consolas" w:hAnsi="Consolas"/>
+          <w:color w:val="000000"/>
+          <w:sz w:val="14"/>
+        </w:rPr>
+        <w:t>244      nd = st.NormalDist(mu=L["media"], sigma=L["sd_pob"])</w:t>
+      </w:r>
+    </w:p>
+    <w:p>
+      <w:pPr>
+        <w:spacing w:before="0" w:after="0" w:line="240" w:lineRule="auto"/>
+      </w:pPr>
+      <w:r>
+        <w:rPr>
+          <w:rFonts w:ascii="Consolas" w:hAnsi="Consolas"/>
+          <w:color w:val="000000"/>
+          <w:sz w:val="14"/>
+        </w:rPr>
+        <w:t>245      xs = [x / 2 for x in range(10, 140)]</w:t>
+      </w:r>
+    </w:p>
+    <w:p>
+      <w:pPr>
+        <w:spacing w:before="0" w:after="0" w:line="240" w:lineRule="auto"/>
+      </w:pPr>
+      <w:r>
+        <w:rPr>
+          <w:rFonts w:ascii="Consolas" w:hAnsi="Consolas"/>
+          <w:color w:val="000000"/>
+          <w:sz w:val="14"/>
+        </w:rPr>
+        <w:t>246      ax.plot(xs, [nd.pdf(x) for x in xs], color=ACENTO, linewidth=2,</w:t>
+      </w:r>
+    </w:p>
+    <w:p>
+      <w:pPr>
+        <w:spacing w:before="0" w:after="0" w:line="240" w:lineRule="auto"/>
+      </w:pPr>
+      <w:r>
+        <w:rPr>
+          <w:rFonts w:ascii="Consolas" w:hAnsi="Consolas"/>
+          <w:color w:val="000000"/>
+          <w:sz w:val="14"/>
+        </w:rPr>
+        <w:t>247              label=f"Normal({L['media']:.1f}, {L['sd_pob']:.1f})")</w:t>
+      </w:r>
+    </w:p>
+    <w:p>
+      <w:pPr>
+        <w:spacing w:before="0" w:after="0" w:line="240" w:lineRule="auto"/>
+      </w:pPr>
+      <w:r>
+        <w:rPr>
+          <w:rFonts w:ascii="Consolas" w:hAnsi="Consolas"/>
+          <w:color w:val="000000"/>
+          <w:sz w:val="14"/>
+        </w:rPr>
+        <w:t>248      ax.axvline(38, color=VERDE, linewidth=2.6, label="Garantia propuesta: 38 min")</w:t>
+      </w:r>
+    </w:p>
+    <w:p>
+      <w:pPr>
+        <w:spacing w:before="0" w:after="0" w:line="240" w:lineRule="auto"/>
+      </w:pPr>
+      <w:r>
+        <w:rPr>
+          <w:rFonts w:ascii="Consolas" w:hAnsi="Consolas"/>
+          <w:color w:val="000000"/>
+          <w:sz w:val="14"/>
+        </w:rPr>
+        <w:t>249      for a in atipicos:</w:t>
+      </w:r>
+    </w:p>
+    <w:p>
+      <w:pPr>
+        <w:spacing w:before="0" w:after="0" w:line="240" w:lineRule="auto"/>
+      </w:pPr>
+      <w:r>
+        <w:rPr>
+          <w:rFonts w:ascii="Consolas" w:hAnsi="Consolas"/>
+          <w:color w:val="000000"/>
+          <w:sz w:val="14"/>
+        </w:rPr>
+        <w:t>250          ax.plot(a, 0.002, marker="v", color=RIESGO, markersize=8)</w:t>
+      </w:r>
+    </w:p>
+    <w:p>
+      <w:pPr>
+        <w:spacing w:before="0" w:after="0" w:line="240" w:lineRule="auto"/>
+      </w:pPr>
+      <w:r>
+        <w:rPr>
+          <w:rFonts w:ascii="Consolas" w:hAnsi="Consolas"/>
+          <w:color w:val="000000"/>
+          <w:sz w:val="14"/>
+        </w:rPr>
+        <w:t>251      ax.set_xlabel("Minutos desde la confirmacion del pedido")</w:t>
+      </w:r>
+    </w:p>
+    <w:p>
+      <w:pPr>
+        <w:spacing w:before="0" w:after="0" w:line="240" w:lineRule="auto"/>
+      </w:pPr>
+      <w:r>
+        <w:rPr>
+          <w:rFonts w:ascii="Consolas" w:hAnsi="Consolas"/>
+          <w:color w:val="000000"/>
+          <w:sz w:val="14"/>
+        </w:rPr>
+        <w:t>252      ax.set_ylabel("Densidad")</w:t>
+      </w:r>
+    </w:p>
+    <w:p>
+      <w:pPr>
+        <w:spacing w:before="0" w:after="0" w:line="240" w:lineRule="auto"/>
+      </w:pPr>
+      <w:r>
+        <w:rPr>
+          <w:rFonts w:ascii="Consolas" w:hAnsi="Consolas"/>
+          <w:color w:val="000000"/>
+          <w:sz w:val="14"/>
+        </w:rPr>
+        <w:t>253      ax.legend(frameon=False, fontsize=8)</w:t>
+      </w:r>
+    </w:p>
+    <w:p>
+      <w:pPr>
+        <w:spacing w:before="0" w:after="0" w:line="240" w:lineRule="auto"/>
+      </w:pPr>
+      <w:r>
+        <w:rPr>
+          <w:rFonts w:ascii="Consolas" w:hAnsi="Consolas"/>
+          <w:color w:val="000000"/>
+          <w:sz w:val="14"/>
+        </w:rPr>
+        <w:t>254      ax.spines[["top", "right"]].set_visible(False)</w:t>
+      </w:r>
+    </w:p>
+    <w:p>
+      <w:pPr>
+        <w:spacing w:before="0" w:after="0" w:line="240" w:lineRule="auto"/>
+      </w:pPr>
+      <w:r>
+        <w:rPr>
+          <w:rFonts w:ascii="Consolas" w:hAnsi="Consolas"/>
+          <w:color w:val="000000"/>
+          <w:sz w:val="14"/>
+        </w:rPr>
+        <w:t>255      fig.tight_layout()</w:t>
+      </w:r>
+    </w:p>
+    <w:p>
+      <w:pPr>
+        <w:spacing w:before="0" w:after="0" w:line="240" w:lineRule="auto"/>
+      </w:pPr>
+      <w:r>
+        <w:rPr>
+          <w:rFonts w:ascii="Consolas" w:hAnsi="Consolas"/>
+          <w:color w:val="000000"/>
+          <w:sz w:val="14"/>
+        </w:rPr>
+        <w:t>256      fig.savefig("grafico_normal.png", dpi=170)</w:t>
+      </w:r>
+    </w:p>
+    <w:p>
+      <w:pPr>
+        <w:spacing w:before="0" w:after="0" w:line="240" w:lineRule="auto"/>
+      </w:pPr>
+      <w:r>
+        <w:rPr>
+          <w:rFonts w:ascii="Consolas" w:hAnsi="Consolas"/>
+          <w:color w:val="000000"/>
+          <w:sz w:val="14"/>
+        </w:rPr>
+        <w:t>257      plt.close(fig)</w:t>
+      </w:r>
+    </w:p>
+    <w:p>
+      <w:pPr>
+        <w:spacing w:before="0" w:after="0" w:line="240" w:lineRule="auto"/>
+      </w:pPr>
+      <w:r>
+        <w:rPr>
+          <w:rFonts w:ascii="Consolas" w:hAnsi="Consolas"/>
+          <w:color w:val="000000"/>
+          <w:sz w:val="14"/>
+        </w:rPr>
+        <w:t xml:space="preserve">258  </w:t>
+      </w:r>
+    </w:p>
+    <w:p>
+      <w:pPr>
+        <w:spacing w:before="0" w:after="0" w:line="240" w:lineRule="auto"/>
+      </w:pPr>
+      <w:r>
+        <w:rPr>
+          <w:rFonts w:ascii="Consolas" w:hAnsi="Consolas"/>
+          <w:color w:val="000000"/>
+          <w:sz w:val="14"/>
+        </w:rPr>
+        <w:t>259      # Grafico 3: diagrama de caja con los limites IQR</w:t>
+      </w:r>
+    </w:p>
+    <w:p>
+      <w:pPr>
+        <w:spacing w:before="0" w:after="0" w:line="240" w:lineRule="auto"/>
+      </w:pPr>
+      <w:r>
+        <w:rPr>
+          <w:rFonts w:ascii="Consolas" w:hAnsi="Consolas"/>
+          <w:color w:val="000000"/>
+          <w:sz w:val="14"/>
+        </w:rPr>
+        <w:t>260      fig, ax = plt.subplots(figsize=(7.2, 2.4))</w:t>
+      </w:r>
+    </w:p>
+    <w:p>
+      <w:pPr>
+        <w:spacing w:before="0" w:after="0" w:line="240" w:lineRule="auto"/>
+      </w:pPr>
+      <w:r>
+        <w:rPr>
+          <w:rFonts w:ascii="Consolas" w:hAnsi="Consolas"/>
+          <w:color w:val="000000"/>
+          <w:sz w:val="14"/>
+        </w:rPr>
+        <w:t>261      # matplotlib &gt;= 3.11 sustituye vert=False por orientation="horizontal"</w:t>
+      </w:r>
+    </w:p>
+    <w:p>
+      <w:pPr>
+        <w:spacing w:before="0" w:after="0" w:line="240" w:lineRule="auto"/>
+      </w:pPr>
+      <w:r>
+        <w:rPr>
+          <w:rFonts w:ascii="Consolas" w:hAnsi="Consolas"/>
+          <w:color w:val="000000"/>
+          <w:sz w:val="14"/>
+        </w:rPr>
+        <w:t>262      orientacion = ({"orientation": "horizontal"}</w:t>
+      </w:r>
+    </w:p>
+    <w:p>
+      <w:pPr>
+        <w:spacing w:before="0" w:after="0" w:line="240" w:lineRule="auto"/>
+      </w:pPr>
+      <w:r>
+        <w:rPr>
+          <w:rFonts w:ascii="Consolas" w:hAnsi="Consolas"/>
+          <w:color w:val="000000"/>
+          <w:sz w:val="14"/>
+        </w:rPr>
+        <w:t>263                     if tuple(int(v) for v in matplotlib.__version__.split(".")[:2]) &gt;= (3, 11)</w:t>
+      </w:r>
+    </w:p>
+    <w:p>
+      <w:pPr>
+        <w:spacing w:before="0" w:after="0" w:line="240" w:lineRule="auto"/>
+      </w:pPr>
+      <w:r>
+        <w:rPr>
+          <w:rFonts w:ascii="Consolas" w:hAnsi="Consolas"/>
+          <w:color w:val="000000"/>
+          <w:sz w:val="14"/>
+        </w:rPr>
+        <w:t>264                     else {"vert": False})</w:t>
+      </w:r>
+    </w:p>
+    <w:p>
+      <w:pPr>
+        <w:spacing w:before="0" w:after="0" w:line="240" w:lineRule="auto"/>
+      </w:pPr>
+      <w:r>
+        <w:rPr>
+          <w:rFonts w:ascii="Consolas" w:hAnsi="Consolas"/>
+          <w:color w:val="000000"/>
+          <w:sz w:val="14"/>
+        </w:rPr>
+        <w:t>265      bp = ax.boxplot(tiempos_entrega, widths=0.5, patch_artist=True,</w:t>
+      </w:r>
+    </w:p>
+    <w:p>
+      <w:pPr>
+        <w:spacing w:before="0" w:after="0" w:line="240" w:lineRule="auto"/>
+      </w:pPr>
+      <w:r>
+        <w:rPr>
+          <w:rFonts w:ascii="Consolas" w:hAnsi="Consolas"/>
+          <w:color w:val="000000"/>
+          <w:sz w:val="14"/>
+        </w:rPr>
+        <w:t>266                      flierprops=dict(marker="o", markerfacecolor=MORADO,</w:t>
+      </w:r>
+    </w:p>
+    <w:p>
+      <w:pPr>
+        <w:spacing w:before="0" w:after="0" w:line="240" w:lineRule="auto"/>
+      </w:pPr>
+      <w:r>
+        <w:rPr>
+          <w:rFonts w:ascii="Consolas" w:hAnsi="Consolas"/>
+          <w:color w:val="000000"/>
+          <w:sz w:val="14"/>
+        </w:rPr>
+        <w:t>267                                      markeredgecolor=MORADO, markersize=7),</w:t>
+      </w:r>
+    </w:p>
+    <w:p>
+      <w:pPr>
+        <w:spacing w:before="0" w:after="0" w:line="240" w:lineRule="auto"/>
+      </w:pPr>
+      <w:r>
+        <w:rPr>
+          <w:rFonts w:ascii="Consolas" w:hAnsi="Consolas"/>
+          <w:color w:val="000000"/>
+          <w:sz w:val="14"/>
+        </w:rPr>
+        <w:t>268                      **orientacion)</w:t>
+      </w:r>
+    </w:p>
+    <w:p>
+      <w:pPr>
+        <w:spacing w:before="0" w:after="0" w:line="240" w:lineRule="auto"/>
+      </w:pPr>
+      <w:r>
+        <w:rPr>
+          <w:rFonts w:ascii="Consolas" w:hAnsi="Consolas"/>
+          <w:color w:val="000000"/>
+          <w:sz w:val="14"/>
+        </w:rPr>
+        <w:t>269      bp["boxes"][0].set_facecolor(TINTA)</w:t>
+      </w:r>
+    </w:p>
+    <w:p>
+      <w:pPr>
+        <w:spacing w:before="0" w:after="0" w:line="240" w:lineRule="auto"/>
+      </w:pPr>
+      <w:r>
+        <w:rPr>
+          <w:rFonts w:ascii="Consolas" w:hAnsi="Consolas"/>
+          <w:color w:val="000000"/>
+          <w:sz w:val="14"/>
+        </w:rPr>
+        <w:t>270      bp["medians"][0].set_color(AMARILLO)</w:t>
+      </w:r>
+    </w:p>
+    <w:p>
+      <w:pPr>
+        <w:spacing w:before="0" w:after="0" w:line="240" w:lineRule="auto"/>
+      </w:pPr>
+      <w:r>
+        <w:rPr>
+          <w:rFonts w:ascii="Consolas" w:hAnsi="Consolas"/>
+          <w:color w:val="000000"/>
+          <w:sz w:val="14"/>
+        </w:rPr>
+        <w:t>271      bp["medians"][0].set_linewidth(2)</w:t>
+      </w:r>
+    </w:p>
+    <w:p>
+      <w:pPr>
+        <w:spacing w:before="0" w:after="0" w:line="240" w:lineRule="auto"/>
+      </w:pPr>
+      <w:r>
+        <w:rPr>
+          <w:rFonts w:ascii="Consolas" w:hAnsi="Consolas"/>
+          <w:color w:val="000000"/>
+          <w:sz w:val="14"/>
+        </w:rPr>
+        <w:t>272      ax.axvline(lim_inf, color=GRIS, linestyle=":", linewidth=1)</w:t>
+      </w:r>
+    </w:p>
+    <w:p>
+      <w:pPr>
+        <w:spacing w:before="0" w:after="0" w:line="240" w:lineRule="auto"/>
+      </w:pPr>
+      <w:r>
+        <w:rPr>
+          <w:rFonts w:ascii="Consolas" w:hAnsi="Consolas"/>
+          <w:color w:val="000000"/>
+          <w:sz w:val="14"/>
+        </w:rPr>
+        <w:t>273      ax.axvline(lim_sup, color=GRIS, linestyle=":", linewidth=1)</w:t>
+      </w:r>
+    </w:p>
+    <w:p>
+      <w:pPr>
+        <w:spacing w:before="0" w:after="0" w:line="240" w:lineRule="auto"/>
+      </w:pPr>
+      <w:r>
+        <w:rPr>
+          <w:rFonts w:ascii="Consolas" w:hAnsi="Consolas"/>
+          <w:color w:val="000000"/>
+          <w:sz w:val="14"/>
+        </w:rPr>
+        <w:t>274      ax.text(lim_inf, 1.36, f"{lim_inf:.1f}", ha="center", fontsize=8, color=GRIS)</w:t>
+      </w:r>
+    </w:p>
+    <w:p>
+      <w:pPr>
+        <w:spacing w:before="0" w:after="0" w:line="240" w:lineRule="auto"/>
+      </w:pPr>
+      <w:r>
+        <w:rPr>
+          <w:rFonts w:ascii="Consolas" w:hAnsi="Consolas"/>
+          <w:color w:val="000000"/>
+          <w:sz w:val="14"/>
+        </w:rPr>
+        <w:t>275      ax.text(lim_sup, 1.36, f"{lim_sup:.1f}", ha="center", fontsize=8, color=GRIS)</w:t>
+      </w:r>
+    </w:p>
+    <w:p>
+      <w:pPr>
+        <w:spacing w:before="0" w:after="0" w:line="240" w:lineRule="auto"/>
+      </w:pPr>
+      <w:r>
+        <w:rPr>
+          <w:rFonts w:ascii="Consolas" w:hAnsi="Consolas"/>
+          <w:color w:val="000000"/>
+          <w:sz w:val="14"/>
+        </w:rPr>
+        <w:t>276      ax.set_yticks([])</w:t>
+      </w:r>
+    </w:p>
+    <w:p>
+      <w:pPr>
+        <w:spacing w:before="0" w:after="0" w:line="240" w:lineRule="auto"/>
+      </w:pPr>
+      <w:r>
+        <w:rPr>
+          <w:rFonts w:ascii="Consolas" w:hAnsi="Consolas"/>
+          <w:color w:val="000000"/>
+          <w:sz w:val="14"/>
+        </w:rPr>
+        <w:t>277      ax.set_xlabel("Minutos")</w:t>
+      </w:r>
+    </w:p>
+    <w:p>
+      <w:pPr>
+        <w:spacing w:before="0" w:after="0" w:line="240" w:lineRule="auto"/>
+      </w:pPr>
+      <w:r>
+        <w:rPr>
+          <w:rFonts w:ascii="Consolas" w:hAnsi="Consolas"/>
+          <w:color w:val="000000"/>
+          <w:sz w:val="14"/>
+        </w:rPr>
+        <w:t>278      ax.spines[["top", "right", "left"]].set_visible(False)</w:t>
+      </w:r>
+    </w:p>
+    <w:p>
+      <w:pPr>
+        <w:spacing w:before="0" w:after="0" w:line="240" w:lineRule="auto"/>
+      </w:pPr>
+      <w:r>
+        <w:rPr>
+          <w:rFonts w:ascii="Consolas" w:hAnsi="Consolas"/>
+          <w:color w:val="000000"/>
+          <w:sz w:val="14"/>
+        </w:rPr>
+        <w:t>279      fig.tight_layout()</w:t>
+      </w:r>
+    </w:p>
+    <w:p>
+      <w:pPr>
+        <w:spacing w:before="0" w:after="0" w:line="240" w:lineRule="auto"/>
+      </w:pPr>
+      <w:r>
+        <w:rPr>
+          <w:rFonts w:ascii="Consolas" w:hAnsi="Consolas"/>
+          <w:color w:val="000000"/>
+          <w:sz w:val="14"/>
+        </w:rPr>
+        <w:t>280      fig.savefig("grafico_boxplot.png", dpi=170)</w:t>
+      </w:r>
+    </w:p>
+    <w:p>
+      <w:pPr>
+        <w:spacing w:before="0" w:after="0" w:line="240" w:lineRule="auto"/>
+      </w:pPr>
+      <w:r>
+        <w:rPr>
+          <w:rFonts w:ascii="Consolas" w:hAnsi="Consolas"/>
+          <w:color w:val="000000"/>
+          <w:sz w:val="14"/>
+        </w:rPr>
+        <w:t>281      plt.close(fig)</w:t>
+      </w:r>
+    </w:p>
+    <w:p>
+      <w:pPr>
+        <w:spacing w:before="0" w:after="0" w:line="240" w:lineRule="auto"/>
+      </w:pPr>
+      <w:r>
+        <w:rPr>
+          <w:rFonts w:ascii="Consolas" w:hAnsi="Consolas"/>
+          <w:color w:val="000000"/>
+          <w:sz w:val="14"/>
+        </w:rPr>
+        <w:t xml:space="preserve">282  </w:t>
+      </w:r>
+    </w:p>
+    <w:p>
+      <w:pPr>
+        <w:spacing w:before="0" w:after="0" w:line="240" w:lineRule="auto"/>
+      </w:pPr>
+      <w:r>
+        <w:rPr>
+          <w:rFonts w:ascii="Consolas" w:hAnsi="Consolas"/>
+          <w:color w:val="000000"/>
+          <w:sz w:val="14"/>
+        </w:rPr>
+        <w:t>283      # Grafico 4: convergencia de la simulacion Monte Carlo</w:t>
+      </w:r>
+    </w:p>
+    <w:p>
+      <w:pPr>
+        <w:spacing w:before="0" w:after="0" w:line="240" w:lineRule="auto"/>
+      </w:pPr>
+      <w:r>
+        <w:rPr>
+          <w:rFonts w:ascii="Consolas" w:hAnsi="Consolas"/>
+          <w:color w:val="000000"/>
+          <w:sz w:val="14"/>
+        </w:rPr>
+        <w:t>284      fig, ax = plt.subplots(figsize=(7.2, 2.8))</w:t>
+      </w:r>
+    </w:p>
+    <w:p>
+      <w:pPr>
+        <w:spacing w:before="0" w:after="0" w:line="240" w:lineRule="auto"/>
+      </w:pPr>
+      <w:r>
+        <w:rPr>
+          <w:rFonts w:ascii="Consolas" w:hAnsi="Consolas"/>
+          <w:color w:val="000000"/>
+          <w:sz w:val="14"/>
+        </w:rPr>
+        <w:t>285      random.seed(SEMILLA)</w:t>
+      </w:r>
+    </w:p>
+    <w:p>
+      <w:pPr>
+        <w:spacing w:before="0" w:after="0" w:line="240" w:lineRule="auto"/>
+      </w:pPr>
+      <w:r>
+        <w:rPr>
+          <w:rFonts w:ascii="Consolas" w:hAnsi="Consolas"/>
+          <w:color w:val="000000"/>
+          <w:sz w:val="14"/>
+        </w:rPr>
+        <w:t>286      acumulado, exitos = [], 0</w:t>
+      </w:r>
+    </w:p>
+    <w:p>
+      <w:pPr>
+        <w:spacing w:before="0" w:after="0" w:line="240" w:lineRule="auto"/>
+      </w:pPr>
+      <w:r>
+        <w:rPr>
+          <w:rFonts w:ascii="Consolas" w:hAnsi="Consolas"/>
+          <w:color w:val="000000"/>
+          <w:sz w:val="14"/>
+        </w:rPr>
+        <w:t>287      for i in range(1, 5001):</w:t>
+      </w:r>
+    </w:p>
+    <w:p>
+      <w:pPr>
+        <w:spacing w:before="0" w:after="0" w:line="240" w:lineRule="auto"/>
+      </w:pPr>
+      <w:r>
+        <w:rPr>
+          <w:rFonts w:ascii="Consolas" w:hAnsi="Consolas"/>
+          <w:color w:val="000000"/>
+          <w:sz w:val="14"/>
+        </w:rPr>
+        <w:t>288          x = sum(1 for _ in range(12) if random.random() &lt; p)</w:t>
+      </w:r>
+    </w:p>
+    <w:p>
+      <w:pPr>
+        <w:spacing w:before="0" w:after="0" w:line="240" w:lineRule="auto"/>
+      </w:pPr>
+      <w:r>
+        <w:rPr>
+          <w:rFonts w:ascii="Consolas" w:hAnsi="Consolas"/>
+          <w:color w:val="000000"/>
+          <w:sz w:val="14"/>
+        </w:rPr>
+        <w:t>289          exitos += 1 if x &gt; 8 else 0</w:t>
+      </w:r>
+    </w:p>
+    <w:p>
+      <w:pPr>
+        <w:spacing w:before="0" w:after="0" w:line="240" w:lineRule="auto"/>
+      </w:pPr>
+      <w:r>
+        <w:rPr>
+          <w:rFonts w:ascii="Consolas" w:hAnsi="Consolas"/>
+          <w:color w:val="000000"/>
+          <w:sz w:val="14"/>
+        </w:rPr>
+        <w:t>290          acumulado.append(exitos / i)</w:t>
+      </w:r>
+    </w:p>
+    <w:p>
+      <w:pPr>
+        <w:spacing w:before="0" w:after="0" w:line="240" w:lineRule="auto"/>
+      </w:pPr>
+      <w:r>
+        <w:rPr>
+          <w:rFonts w:ascii="Consolas" w:hAnsi="Consolas"/>
+          <w:color w:val="000000"/>
+          <w:sz w:val="14"/>
+        </w:rPr>
+        <w:t>291      ax.plot(range(1, 5001), acumulado, color=TINTA, linewidth=1)</w:t>
+      </w:r>
+    </w:p>
+    <w:p>
+      <w:pPr>
+        <w:spacing w:before="0" w:after="0" w:line="240" w:lineRule="auto"/>
+      </w:pPr>
+      <w:r>
+        <w:rPr>
+          <w:rFonts w:ascii="Consolas" w:hAnsi="Consolas"/>
+          <w:color w:val="000000"/>
+          <w:sz w:val="14"/>
+        </w:rPr>
+        <w:t>292      ax.axhline(p_teorica, color=ACENTO, linewidth=1.6,</w:t>
+      </w:r>
+    </w:p>
+    <w:p>
+      <w:pPr>
+        <w:spacing w:before="0" w:after="0" w:line="240" w:lineRule="auto"/>
+      </w:pPr>
+      <w:r>
+        <w:rPr>
+          <w:rFonts w:ascii="Consolas" w:hAnsi="Consolas"/>
+          <w:color w:val="000000"/>
+          <w:sz w:val="14"/>
+        </w:rPr>
+        <w:t>293                 label=f"Valor teorico {p_teorica:.4f}")</w:t>
+      </w:r>
+    </w:p>
+    <w:p>
+      <w:pPr>
+        <w:spacing w:before="0" w:after="0" w:line="240" w:lineRule="auto"/>
+      </w:pPr>
+      <w:r>
+        <w:rPr>
+          <w:rFonts w:ascii="Consolas" w:hAnsi="Consolas"/>
+          <w:color w:val="000000"/>
+          <w:sz w:val="14"/>
+        </w:rPr>
+        <w:t>294      ax.set_xlabel("Turnos simulados")</w:t>
+      </w:r>
+    </w:p>
+    <w:p>
+      <w:pPr>
+        <w:spacing w:before="0" w:after="0" w:line="240" w:lineRule="auto"/>
+      </w:pPr>
+      <w:r>
+        <w:rPr>
+          <w:rFonts w:ascii="Consolas" w:hAnsi="Consolas"/>
+          <w:color w:val="000000"/>
+          <w:sz w:val="14"/>
+        </w:rPr>
+        <w:t>295      ax.set_ylabel("P(X &gt; 8) acumulada")</w:t>
+      </w:r>
+    </w:p>
+    <w:p>
+      <w:pPr>
+        <w:spacing w:before="0" w:after="0" w:line="240" w:lineRule="auto"/>
+      </w:pPr>
+      <w:r>
+        <w:rPr>
+          <w:rFonts w:ascii="Consolas" w:hAnsi="Consolas"/>
+          <w:color w:val="000000"/>
+          <w:sz w:val="14"/>
+        </w:rPr>
+        <w:t>296      ax.set_ylim(0.15, 0.55)</w:t>
+      </w:r>
+    </w:p>
+    <w:p>
+      <w:pPr>
+        <w:spacing w:before="0" w:after="0" w:line="240" w:lineRule="auto"/>
+      </w:pPr>
+      <w:r>
+        <w:rPr>
+          <w:rFonts w:ascii="Consolas" w:hAnsi="Consolas"/>
+          <w:color w:val="000000"/>
+          <w:sz w:val="14"/>
+        </w:rPr>
+        <w:t>297      ax.legend(frameon=False, fontsize=8)</w:t>
+      </w:r>
+    </w:p>
+    <w:p>
+      <w:pPr>
+        <w:spacing w:before="0" w:after="0" w:line="240" w:lineRule="auto"/>
+      </w:pPr>
+      <w:r>
+        <w:rPr>
+          <w:rFonts w:ascii="Consolas" w:hAnsi="Consolas"/>
+          <w:color w:val="000000"/>
+          <w:sz w:val="14"/>
+        </w:rPr>
+        <w:t>298      ax.spines[["top", "right"]].set_visible(False)</w:t>
+      </w:r>
+    </w:p>
+    <w:p>
+      <w:pPr>
+        <w:spacing w:before="0" w:after="0" w:line="240" w:lineRule="auto"/>
+      </w:pPr>
+      <w:r>
+        <w:rPr>
+          <w:rFonts w:ascii="Consolas" w:hAnsi="Consolas"/>
+          <w:color w:val="000000"/>
+          <w:sz w:val="14"/>
+        </w:rPr>
+        <w:t>299      fig.tight_layout()</w:t>
+      </w:r>
+    </w:p>
+    <w:p>
+      <w:pPr>
+        <w:spacing w:before="0" w:after="0" w:line="240" w:lineRule="auto"/>
+      </w:pPr>
+      <w:r>
+        <w:rPr>
+          <w:rFonts w:ascii="Consolas" w:hAnsi="Consolas"/>
+          <w:color w:val="000000"/>
+          <w:sz w:val="14"/>
+        </w:rPr>
+        <w:t>300      fig.savefig("grafico_convergencia.png", dpi=170)</w:t>
+      </w:r>
+    </w:p>
+    <w:p>
+      <w:pPr>
+        <w:spacing w:before="0" w:after="0" w:line="240" w:lineRule="auto"/>
+      </w:pPr>
+      <w:r>
+        <w:rPr>
+          <w:rFonts w:ascii="Consolas" w:hAnsi="Consolas"/>
+          <w:color w:val="000000"/>
+          <w:sz w:val="14"/>
+        </w:rPr>
+        <w:t>301      plt.close(fig)</w:t>
+      </w:r>
+    </w:p>
+    <w:p>
+      <w:pPr>
+        <w:spacing w:before="0" w:after="0" w:line="240" w:lineRule="auto"/>
+      </w:pPr>
+      <w:r>
+        <w:rPr>
+          <w:rFonts w:ascii="Consolas" w:hAnsi="Consolas"/>
+          <w:color w:val="000000"/>
+          <w:sz w:val="14"/>
+        </w:rPr>
+        <w:t xml:space="preserve">302  </w:t>
+      </w:r>
+    </w:p>
+    <w:p>
+      <w:pPr>
+        <w:spacing w:before="0" w:after="0" w:line="240" w:lineRule="auto"/>
+      </w:pPr>
+      <w:r>
+        <w:rPr>
+          <w:rFonts w:ascii="Consolas" w:hAnsi="Consolas"/>
+          <w:color w:val="000000"/>
+          <w:sz w:val="14"/>
+        </w:rPr>
+        <w:t>303      print("\nGraficos exportados: grafico_binomial.png, grafico_normal.png, "</w:t>
+      </w:r>
+    </w:p>
+    <w:p>
+      <w:pPr>
+        <w:spacing w:before="0" w:after="0" w:line="240" w:lineRule="auto"/>
+      </w:pPr>
+      <w:r>
+        <w:rPr>
+          <w:rFonts w:ascii="Consolas" w:hAnsi="Consolas"/>
+          <w:color w:val="000000"/>
+          <w:sz w:val="14"/>
+        </w:rPr>
+        <w:t>304            "grafico_boxplot.png, grafico_convergencia.png")</w:t>
+      </w:r>
+    </w:p>
+    <w:p>
+      <w:pPr>
+        <w:spacing w:before="0" w:after="0" w:line="240" w:lineRule="auto"/>
+      </w:pPr>
+      <w:r>
+        <w:rPr>
+          <w:rFonts w:ascii="Consolas" w:hAnsi="Consolas"/>
+          <w:color w:val="000000"/>
+          <w:sz w:val="14"/>
+        </w:rPr>
+        <w:t xml:space="preserve">305  </w:t>
+      </w:r>
+    </w:p>
+    <w:p>
+      <w:pPr>
+        <w:spacing w:before="0" w:after="0" w:line="240" w:lineRule="auto"/>
+      </w:pPr>
+      <w:r>
+        <w:rPr>
+          <w:rFonts w:ascii="Consolas" w:hAnsi="Consolas"/>
+          <w:color w:val="000000"/>
+          <w:sz w:val="14"/>
+        </w:rPr>
+        <w:t xml:space="preserve">306  </w:t>
+      </w:r>
+    </w:p>
+    <w:p>
+      <w:pPr>
+        <w:spacing w:before="0" w:after="0" w:line="240" w:lineRule="auto"/>
+      </w:pPr>
+      <w:r>
+        <w:rPr>
+          <w:rFonts w:ascii="Consolas" w:hAnsi="Consolas"/>
+          <w:color w:val="000000"/>
+          <w:sz w:val="14"/>
+        </w:rPr>
+        <w:t>307  titulo("TAREA 5 - VISUALIZACION")</w:t>
+      </w:r>
+    </w:p>
+    <w:p>
+      <w:pPr>
+        <w:spacing w:before="0" w:after="0" w:line="240" w:lineRule="auto"/>
+      </w:pPr>
+      <w:r>
+        <w:rPr>
+          <w:rFonts w:ascii="Consolas" w:hAnsi="Consolas"/>
+          <w:color w:val="000000"/>
+          <w:sz w:val="14"/>
+        </w:rPr>
+        <w:t>308  graficar()</w:t>
+      </w:r>
+    </w:p>
+    <w:p>
+      <w:pPr>
+        <w:spacing w:before="0" w:after="0" w:line="240" w:lineRule="auto"/>
+      </w:pPr>
+      <w:r>
+        <w:rPr>
+          <w:rFonts w:ascii="Consolas" w:hAnsi="Consolas"/>
+          <w:color w:val="000000"/>
+          <w:sz w:val="14"/>
+        </w:rPr>
+        <w:t xml:space="preserve">309  </w:t>
+      </w:r>
+    </w:p>
+    <w:p>
+      <w:pPr>
+        <w:spacing w:before="0" w:after="0" w:line="240" w:lineRule="auto"/>
+      </w:pPr>
+      <w:r>
+        <w:rPr>
+          <w:rFonts w:ascii="Consolas" w:hAnsi="Consolas"/>
+          <w:color w:val="000000"/>
+          <w:sz w:val="14"/>
+        </w:rPr>
+        <w:t xml:space="preserve">310  </w:t>
+      </w:r>
+    </w:p>
+    <w:p>
+      <w:pPr>
+        <w:spacing w:before="0" w:after="0" w:line="240" w:lineRule="auto"/>
+      </w:pPr>
+      <w:r>
+        <w:rPr>
+          <w:rFonts w:ascii="Consolas" w:hAnsi="Consolas"/>
+          <w:color w:val="000000"/>
+          <w:sz w:val="14"/>
+        </w:rPr>
+        <w:t>311  # =====================================================================</w:t>
+      </w:r>
+    </w:p>
+    <w:p>
+      <w:pPr>
+        <w:spacing w:before="0" w:after="0" w:line="240" w:lineRule="auto"/>
+      </w:pPr>
+      <w:r>
+        <w:rPr>
+          <w:rFonts w:ascii="Consolas" w:hAnsi="Consolas"/>
+          <w:color w:val="000000"/>
+          <w:sz w:val="14"/>
+        </w:rPr>
+        <w:t>312  # TAREA 6 - RESUMEN PARA LA RECOMENDACION DE NEGOCIO</w:t>
+      </w:r>
+    </w:p>
+    <w:p>
+      <w:pPr>
+        <w:spacing w:before="0" w:after="0" w:line="240" w:lineRule="auto"/>
+      </w:pPr>
+      <w:r>
+        <w:rPr>
+          <w:rFonts w:ascii="Consolas" w:hAnsi="Consolas"/>
+          <w:color w:val="000000"/>
+          <w:sz w:val="14"/>
+        </w:rPr>
+        <w:t>313  # =====================================================================</w:t>
+      </w:r>
+    </w:p>
+    <w:p>
+      <w:pPr>
+        <w:spacing w:before="0" w:after="0" w:line="240" w:lineRule="auto"/>
+      </w:pPr>
+      <w:r>
+        <w:rPr>
+          <w:rFonts w:ascii="Consolas" w:hAnsi="Consolas"/>
+          <w:color w:val="000000"/>
+          <w:sz w:val="14"/>
+        </w:rPr>
+        <w:t xml:space="preserve">314  </w:t>
+      </w:r>
+    </w:p>
+    <w:p>
+      <w:pPr>
+        <w:spacing w:before="0" w:after="0" w:line="240" w:lineRule="auto"/>
+      </w:pPr>
+      <w:r>
+        <w:rPr>
+          <w:rFonts w:ascii="Consolas" w:hAnsi="Consolas"/>
+          <w:color w:val="000000"/>
+          <w:sz w:val="14"/>
+        </w:rPr>
+        <w:t>315  titulo("TAREA 6 - CIFRAS QUE SOSTIENEN LA RECOMENDACION")</w:t>
+      </w:r>
+    </w:p>
+    <w:p>
+      <w:pPr>
+        <w:spacing w:before="0" w:after="0" w:line="240" w:lineRule="auto"/>
+      </w:pPr>
+      <w:r>
+        <w:rPr>
+          <w:rFonts w:ascii="Consolas" w:hAnsi="Consolas"/>
+          <w:color w:val="000000"/>
+          <w:sz w:val="14"/>
+        </w:rPr>
+        <w:t>316  print(f"""</w:t>
+      </w:r>
+    </w:p>
+    <w:p>
+      <w:pPr>
+        <w:spacing w:before="0" w:after="0" w:line="240" w:lineRule="auto"/>
+      </w:pPr>
+      <w:r>
+        <w:rPr>
+          <w:rFonts w:ascii="Consolas" w:hAnsi="Consolas"/>
+          <w:color w:val="000000"/>
+          <w:sz w:val="14"/>
+        </w:rPr>
+        <w:t>317  DECISION 1 - Cajero adicional</w:t>
+      </w:r>
+    </w:p>
+    <w:p>
+      <w:pPr>
+        <w:spacing w:before="0" w:after="0" w:line="240" w:lineRule="auto"/>
+      </w:pPr>
+      <w:r>
+        <w:rPr>
+          <w:rFonts w:ascii="Consolas" w:hAnsi="Consolas"/>
+          <w:color w:val="000000"/>
+          <w:sz w:val="14"/>
+        </w:rPr>
+        <w:t>318    P(X &gt; 8) teorica ................. {p_teorica * 100:.2f}%</w:t>
+      </w:r>
+    </w:p>
+    <w:p>
+      <w:pPr>
+        <w:spacing w:before="0" w:after="0" w:line="240" w:lineRule="auto"/>
+      </w:pPr>
+      <w:r>
+        <w:rPr>
+          <w:rFonts w:ascii="Consolas" w:hAnsi="Consolas"/>
+          <w:color w:val="000000"/>
+          <w:sz w:val="14"/>
+        </w:rPr>
+        <w:t>319    Proporcion empirica .............. {p_empirica * 100:.2f}% ({dias_criticos} de 30 dias)</w:t>
+      </w:r>
+    </w:p>
+    <w:p>
+      <w:pPr>
+        <w:spacing w:before="0" w:after="0" w:line="240" w:lineRule="auto"/>
+      </w:pPr>
+      <w:r>
+        <w:rPr>
+          <w:rFonts w:ascii="Consolas" w:hAnsi="Consolas"/>
+          <w:color w:val="000000"/>
+          <w:sz w:val="14"/>
+        </w:rPr>
+        <w:t>320    Simulacion (10,000 turnos) ....... {resultados_sim[10_000] * 100:.2f}%</w:t>
+      </w:r>
+    </w:p>
+    <w:p>
+      <w:pPr>
+        <w:spacing w:before="0" w:after="0" w:line="240" w:lineRule="auto"/>
+      </w:pPr>
+      <w:r>
+        <w:rPr>
+          <w:rFonts w:ascii="Consolas" w:hAnsi="Consolas"/>
+          <w:color w:val="000000"/>
+          <w:sz w:val="14"/>
+        </w:rPr>
+        <w:t>321    Lectura: la saturacion ocurre en 1 de cada 3 turnos pico.</w:t>
+      </w:r>
+    </w:p>
+    <w:p>
+      <w:pPr>
+        <w:spacing w:before="0" w:after="0" w:line="240" w:lineRule="auto"/>
+      </w:pPr>
+      <w:r>
+        <w:rPr>
+          <w:rFonts w:ascii="Consolas" w:hAnsi="Consolas"/>
+          <w:color w:val="000000"/>
+          <w:sz w:val="14"/>
+        </w:rPr>
+        <w:t xml:space="preserve">322  </w:t>
+      </w:r>
+    </w:p>
+    <w:p>
+      <w:pPr>
+        <w:spacing w:before="0" w:after="0" w:line="240" w:lineRule="auto"/>
+      </w:pPr>
+      <w:r>
+        <w:rPr>
+          <w:rFonts w:ascii="Consolas" w:hAnsi="Consolas"/>
+          <w:color w:val="000000"/>
+          <w:sz w:val="14"/>
+        </w:rPr>
+        <w:t>323  DECISION 2 - Garantia de entrega</w:t>
+      </w:r>
+    </w:p>
+    <w:p>
+      <w:pPr>
+        <w:spacing w:before="0" w:after="0" w:line="240" w:lineRule="auto"/>
+      </w:pPr>
+      <w:r>
+        <w:rPr>
+          <w:rFonts w:ascii="Consolas" w:hAnsi="Consolas"/>
+          <w:color w:val="000000"/>
+          <w:sz w:val="14"/>
+        </w:rPr>
+        <w:t>324    Media depurada ................... {L['media']:.2f} min</w:t>
+      </w:r>
+    </w:p>
+    <w:p>
+      <w:pPr>
+        <w:spacing w:before="0" w:after="0" w:line="240" w:lineRule="auto"/>
+      </w:pPr>
+      <w:r>
+        <w:rPr>
+          <w:rFonts w:ascii="Consolas" w:hAnsi="Consolas"/>
+          <w:color w:val="000000"/>
+          <w:sz w:val="14"/>
+        </w:rPr>
+        <w:t>325    Desviacion estandar depurada ..... {L['sd_pob']:.2f} min</w:t>
+      </w:r>
+    </w:p>
+    <w:p>
+      <w:pPr>
+        <w:spacing w:before="0" w:after="0" w:line="240" w:lineRule="auto"/>
+      </w:pPr>
+      <w:r>
+        <w:rPr>
+          <w:rFonts w:ascii="Consolas" w:hAnsi="Consolas"/>
+          <w:color w:val="000000"/>
+          <w:sz w:val="14"/>
+        </w:rPr>
+        <w:t>326    Atipicos excluidos ............... {atipicos}</w:t>
+      </w:r>
+    </w:p>
+    <w:p>
+      <w:pPr>
+        <w:spacing w:before="0" w:after="0" w:line="240" w:lineRule="auto"/>
+      </w:pPr>
+      <w:r>
+        <w:rPr>
+          <w:rFonts w:ascii="Consolas" w:hAnsi="Consolas"/>
+          <w:color w:val="000000"/>
+          <w:sz w:val="14"/>
+        </w:rPr>
+        <w:t>327    Percentil 90 ..................... {x_garantia:.2f} min  -&gt;  se promete 38 min</w:t>
+      </w:r>
+    </w:p>
+    <w:p>
+      <w:pPr>
+        <w:spacing w:before="0" w:after="0" w:line="240" w:lineRule="auto"/>
+      </w:pPr>
+      <w:r>
+        <w:rPr>
+          <w:rFonts w:ascii="Consolas" w:hAnsi="Consolas"/>
+          <w:color w:val="000000"/>
+          <w:sz w:val="14"/>
+        </w:rPr>
+        <w:t>328    Incumplimiento esperado .......... {(1 - normal_limpia.cdf(38)) * 100:.2f}%</w:t>
+      </w:r>
+    </w:p>
+    <w:p>
+      <w:pPr>
+        <w:spacing w:before="0" w:after="0" w:line="240" w:lineRule="auto"/>
+      </w:pPr>
+      <w:r>
+        <w:rPr>
+          <w:rFonts w:ascii="Consolas" w:hAnsi="Consolas"/>
+          <w:color w:val="000000"/>
+          <w:sz w:val="14"/>
+        </w:rPr>
+        <w:t>329  """)</w:t>
+      </w:r>
+    </w:p>
     <w:sectPr>
       <w:footerReference w:type="default" r:id="rId9"/>
       <w:pgSz w:w="12240" w:h="15840"/>

</xml_diff>